<commit_message>
Specs, audit and compliance workbooks brought up to date with the build (status 14 October 2026)
- EIR spec v4: 100 dated status notes and 19 marked corrections across sections 0-17; FLI spec v1:
  46 notes, 4 corrections; UI/report spec, the 9 Oct system audit (addendum with a 47-row table)
  and the two reviews carry a 14 October status; bootstrap README corrected
- Compliance workbooks regenerated: governance keys corrected (61 settings; unread keys tagged),
  RBM rebuilt from the Gazette's paragraphs (19 rows), CS1 7 new rows; build_audit.py now fails on
  an unknown governance key or a cited method that doesn't exist
- Specs re-rendered to .docx and .pdf (copies in OneDrive 3. Project Execution/specs; previous
  versions archived)

Co-Authored-By: Claude Opus 5.5 <noreply@anthropic.com>
</commit_message>
<xml_diff>
--- a/docs/MAIIC_FLI_Module_Specification_v1_2026-10-13.docx
+++ b/docs/MAIIC_FLI_Module_Specification_v1_2026-10-13.docx
@@ -62,7 +62,7 @@
           <w:color w:val="5B6470"/>
           <w:sz w:val="18"/>
         </w:rPr>
-        <w:t>Draft for review, updated 13 October 2026 evening (decisions D-F13 to D-F16: the earlier screens kept and improved, the macro statistics screens, the reports that read the month record, the month-end job). Builds on specification version 4, sections 13 (macro statistics), 14 (forward-looking adjustments) and 15 (economic scenarios), which stay in force; where this document decides something new, it says so and it governs for the forward-looking module.</w:t>
+        <w:t>Draft for review, status-checked against the code on 14 October 2026 (abe140d plus the uncommitted working tree; dated 'Status 14 October 2026' notes, nothing earlier deleted). Earlier status: Draft for review, updated 13 October 2026 evening (decisions D-F13 to D-F16: the earlier screens kept and improved, the macro statistics screens, the reports that read the month record, the month-end job). Builds on specification version 4, sections 13 (macro statistics), 14 (forward-looking adjustments) and 15 (economic scenarios), which stay in force; where this document decides something new, it says so and it governs for the forward-looking module.</w:t>
       </w:r>
     </w:p>
     <w:p>
@@ -874,7 +874,74 @@
                 <w:i w:val="0"/>
                 <w:sz w:val="17"/>
               </w:rPr>
-              <w:t xml:space="preserve"> the vintage is the load date, not the publisher's release date</w:t>
+              <w:t xml:space="preserve"> the vintage is the load date, not the publisher's release date. </w:t>
+            </w:r>
+            <w:r>
+              <w:rPr>
+                <w:b/>
+                <w:i w:val="0"/>
+                <w:sz w:val="17"/>
+              </w:rPr>
+              <w:t>Status 14 October 2026:</w:t>
+            </w:r>
+            <w:r>
+              <w:rPr>
+                <w:b w:val="0"/>
+                <w:i w:val="0"/>
+                <w:sz w:val="17"/>
+              </w:rPr>
+              <w:t xml:space="preserve"> a </w:t>
+            </w:r>
+            <w:r>
+              <w:rPr>
+                <w:rFonts w:ascii="Consolas" w:hAnsi="Consolas"/>
+                <w:b w:val="0"/>
+                <w:i w:val="0"/>
+                <w:sz w:val="17"/>
+              </w:rPr>
+              <w:t>published_at</w:t>
+            </w:r>
+            <w:r>
+              <w:rPr>
+                <w:b w:val="0"/>
+                <w:i w:val="0"/>
+                <w:sz w:val="17"/>
+              </w:rPr>
+              <w:t xml:space="preserve"> column now exists on </w:t>
+            </w:r>
+            <w:r>
+              <w:rPr>
+                <w:rFonts w:ascii="Consolas" w:hAnsi="Consolas"/>
+                <w:b w:val="0"/>
+                <w:i w:val="0"/>
+                <w:sz w:val="17"/>
+              </w:rPr>
+              <w:t>macro_statistics_data</w:t>
+            </w:r>
+            <w:r>
+              <w:rPr>
+                <w:b w:val="0"/>
+                <w:i w:val="0"/>
+                <w:sz w:val="17"/>
+              </w:rPr>
+              <w:t xml:space="preserve"> and </w:t>
+            </w:r>
+            <w:r>
+              <w:rPr>
+                <w:rFonts w:ascii="Consolas" w:hAnsi="Consolas"/>
+                <w:b w:val="0"/>
+                <w:i w:val="0"/>
+                <w:sz w:val="17"/>
+              </w:rPr>
+              <w:t>macro_credit_loss_data</w:t>
+            </w:r>
+            <w:r>
+              <w:rPr>
+                <w:b w:val="0"/>
+                <w:i w:val="0"/>
+                <w:sz w:val="17"/>
+              </w:rPr>
+              <w:t xml:space="preserve"> and the bridge honours it (FliBridgeService.php:57-69, 197-203), but 0 of 261 observations carry a release date in maiic_ifrs9_demo or maiic_ifrs9_results2, and a revision still replaces the earlier value (D-F10).</w:t>
             </w:r>
           </w:p>
         </w:tc>
@@ -1131,7 +1198,57 @@
                 <w:i w:val="0"/>
                 <w:sz w:val="17"/>
               </w:rPr>
-              <w:t xml:space="preserve"> no model registry: a fit is re-estimated and re-approved every month instead of once a year</w:t>
+              <w:t xml:space="preserve"> no model registry: a fit is re-estimated and re-approved every month instead of once a year. </w:t>
+            </w:r>
+            <w:r>
+              <w:rPr>
+                <w:b/>
+                <w:i w:val="0"/>
+                <w:sz w:val="17"/>
+              </w:rPr>
+              <w:t>Status 14 October 2026:</w:t>
+            </w:r>
+            <w:r>
+              <w:rPr>
+                <w:b w:val="0"/>
+                <w:i w:val="0"/>
+                <w:sz w:val="17"/>
+              </w:rPr>
+              <w:t xml:space="preserve"> the registry is built (</w:t>
+            </w:r>
+            <w:r>
+              <w:rPr>
+                <w:rFonts w:ascii="Consolas" w:hAnsi="Consolas"/>
+                <w:b w:val="0"/>
+                <w:i w:val="0"/>
+                <w:sz w:val="17"/>
+              </w:rPr>
+              <w:t>fli_models</w:t>
+            </w:r>
+            <w:r>
+              <w:rPr>
+                <w:b w:val="0"/>
+                <w:i w:val="0"/>
+                <w:sz w:val="17"/>
+              </w:rPr>
+              <w:t xml:space="preserve">, </w:t>
+            </w:r>
+            <w:r>
+              <w:rPr>
+                <w:rFonts w:ascii="Consolas" w:hAnsi="Consolas"/>
+                <w:b w:val="0"/>
+                <w:i w:val="0"/>
+                <w:sz w:val="17"/>
+              </w:rPr>
+              <w:t>fli_model_versions</w:t>
+            </w:r>
+            <w:r>
+              <w:rPr>
+                <w:b w:val="0"/>
+                <w:i w:val="0"/>
+                <w:sz w:val="17"/>
+              </w:rPr>
+              <w:t>, FliModelRegistry): a published version governs later months without a new fit (FliRouteServiceTest::test_an_approved_fit_is_a_version_in_force_from_its_month_until_a_later_one); the demonstration database still has one version per month (versions 1 to 8, January to August 2026).</w:t>
             </w:r>
           </w:p>
         </w:tc>
@@ -1310,7 +1427,40 @@
                 <w:i w:val="0"/>
                 <w:sz w:val="17"/>
               </w:rPr>
-              <w:t xml:space="preserve"> no check that an overlay does not repeat a risk the model already carries</w:t>
+              <w:t xml:space="preserve"> no check that an overlay does not repeat a risk the model already carries. </w:t>
+            </w:r>
+            <w:r>
+              <w:rPr>
+                <w:b/>
+                <w:i w:val="0"/>
+                <w:sz w:val="17"/>
+              </w:rPr>
+              <w:t>Status 14 October 2026:</w:t>
+            </w:r>
+            <w:r>
+              <w:rPr>
+                <w:b w:val="0"/>
+                <w:i w:val="0"/>
+                <w:sz w:val="17"/>
+              </w:rPr>
+              <w:t xml:space="preserve"> built (D-F9): </w:t>
+            </w:r>
+            <w:r>
+              <w:rPr>
+                <w:rFonts w:ascii="Consolas" w:hAnsi="Consolas"/>
+                <w:b w:val="0"/>
+                <w:i w:val="0"/>
+                <w:sz w:val="17"/>
+              </w:rPr>
+              <w:t>risk_driver</w:t>
+            </w:r>
+            <w:r>
+              <w:rPr>
+                <w:b w:val="0"/>
+                <w:i w:val="0"/>
+                <w:sz w:val="17"/>
+              </w:rPr>
+              <w:t xml:space="preserve"> and a double-count review on the register (OverlayServiceTest::test_an_overlay_on_the_models_driver_needs_a_double_count_review).</w:t>
             </w:r>
           </w:p>
         </w:tc>
@@ -1391,7 +1541,40 @@
                 <w:i w:val="0"/>
                 <w:sz w:val="17"/>
               </w:rPr>
-              <w:t xml:space="preserve"> once LGD or EAD vary by scenario, the ECL must be computed per scenario and then weighted</w:t>
+              <w:t xml:space="preserve"> once LGD or EAD vary by scenario, the ECL must be computed per scenario and then weighted. </w:t>
+            </w:r>
+            <w:r>
+              <w:rPr>
+                <w:b/>
+                <w:i w:val="0"/>
+                <w:sz w:val="17"/>
+              </w:rPr>
+              <w:t>Status 14 October 2026:</w:t>
+            </w:r>
+            <w:r>
+              <w:rPr>
+                <w:b w:val="0"/>
+                <w:i w:val="0"/>
+                <w:sz w:val="17"/>
+              </w:rPr>
+              <w:t xml:space="preserve"> the month record (FliCloseService::record) now stores each loan's ECL per scenario in </w:t>
+            </w:r>
+            <w:r>
+              <w:rPr>
+                <w:rFonts w:ascii="Consolas" w:hAnsi="Consolas"/>
+                <w:b w:val="0"/>
+                <w:i w:val="0"/>
+                <w:sz w:val="17"/>
+              </w:rPr>
+              <w:t>ecl_scenario_results</w:t>
+            </w:r>
+            <w:r>
+              <w:rPr>
+                <w:b w:val="0"/>
+                <w:i w:val="0"/>
+                <w:sz w:val="17"/>
+              </w:rPr>
+              <w:t xml:space="preserve"> on the undiscounted engine measure; the discounted allowance (TimePhasedEclService) weights its per-scenario shortfalls inside each loan and keeps no per-scenario row (D-F3).</w:t>
             </w:r>
           </w:p>
         </w:tc>
@@ -1526,6 +1709,81 @@
               </w:rPr>
               <w:t>Gap</w:t>
             </w:r>
+            <w:r>
+              <w:rPr>
+                <w:b w:val="0"/>
+                <w:i w:val="0"/>
+                <w:sz w:val="17"/>
+              </w:rPr>
+              <w:t xml:space="preserve">. </w:t>
+            </w:r>
+            <w:r>
+              <w:rPr>
+                <w:b/>
+                <w:i w:val="0"/>
+                <w:sz w:val="17"/>
+              </w:rPr>
+              <w:t>Status 14 October 2026:</w:t>
+            </w:r>
+            <w:r>
+              <w:rPr>
+                <w:b w:val="0"/>
+                <w:i w:val="0"/>
+                <w:sz w:val="17"/>
+              </w:rPr>
+              <w:t xml:space="preserve"> the tables are now written: FliProjectionService puts a per-portfolio, per-scenario, year-by-year PD with reversion into </w:t>
+            </w:r>
+            <w:r>
+              <w:rPr>
+                <w:rFonts w:ascii="Consolas" w:hAnsi="Consolas"/>
+                <w:b w:val="0"/>
+                <w:i w:val="0"/>
+                <w:sz w:val="17"/>
+              </w:rPr>
+              <w:t>ecl_projection_runs</w:t>
+            </w:r>
+            <w:r>
+              <w:rPr>
+                <w:b w:val="0"/>
+                <w:i w:val="0"/>
+                <w:sz w:val="17"/>
+              </w:rPr>
+              <w:t xml:space="preserve"> and </w:t>
+            </w:r>
+            <w:r>
+              <w:rPr>
+                <w:rFonts w:ascii="Consolas" w:hAnsi="Consolas"/>
+                <w:b w:val="0"/>
+                <w:i w:val="0"/>
+                <w:sz w:val="17"/>
+              </w:rPr>
+              <w:t>ecl_pd_term_structures</w:t>
+            </w:r>
+            <w:r>
+              <w:rPr>
+                <w:b w:val="0"/>
+                <w:i w:val="0"/>
+                <w:sz w:val="17"/>
+              </w:rPr>
+              <w:t xml:space="preserve"> (evidence only, source </w:t>
+            </w:r>
+            <w:r>
+              <w:rPr>
+                <w:rFonts w:ascii="Consolas" w:hAnsi="Consolas"/>
+                <w:b w:val="0"/>
+                <w:i w:val="0"/>
+                <w:sz w:val="17"/>
+              </w:rPr>
+              <w:t>fli-projection</w:t>
+            </w:r>
+            <w:r>
+              <w:rPr>
+                <w:b w:val="0"/>
+                <w:i w:val="0"/>
+                <w:sz w:val="17"/>
+              </w:rPr>
+              <w:t>), and TimePhasedEclService writes loan-level monthly marginal PDs and shortfalls for the discounted allowance, on one constant hazard per scenario (D-F4).</w:t>
+            </w:r>
           </w:p>
         </w:tc>
       </w:tr>
@@ -1704,7 +1962,108 @@
                 <w:i w:val="0"/>
                 <w:sz w:val="17"/>
               </w:rPr>
-              <w:t xml:space="preserve"> PLR-linked floating loans use the original EIR as a labelled proxy, not the current effective rate</w:t>
+              <w:t xml:space="preserve"> PLR-linked floating loans use the original EIR as a labelled proxy, not the current effective rate. </w:t>
+            </w:r>
+            <w:r>
+              <w:rPr>
+                <w:b/>
+                <w:i w:val="0"/>
+                <w:sz w:val="17"/>
+              </w:rPr>
+              <w:t>Status 14 October 2026:</w:t>
+            </w:r>
+            <w:r>
+              <w:rPr>
+                <w:b w:val="0"/>
+                <w:i w:val="0"/>
+                <w:sz w:val="17"/>
+              </w:rPr>
+              <w:t xml:space="preserve"> until commit 216aee2 (14 October) the month-end booked the ECL undiscounted. The month-end now runs </w:t>
+            </w:r>
+            <w:r>
+              <w:rPr>
+                <w:rFonts w:ascii="Consolas" w:hAnsi="Consolas"/>
+                <w:b w:val="0"/>
+                <w:i w:val="0"/>
+                <w:sz w:val="17"/>
+              </w:rPr>
+              <w:t>ifrs9:segment-ecl --discounting=discounted</w:t>
+            </w:r>
+            <w:r>
+              <w:rPr>
+                <w:b w:val="0"/>
+                <w:i w:val="0"/>
+                <w:sz w:val="17"/>
+              </w:rPr>
+              <w:t xml:space="preserve"> (FliMonthEndCommand.php:85; discounted is also the command's default, SegmentEcl.php:42): </w:t>
+            </w:r>
+            <w:r>
+              <w:rPr>
+                <w:rFonts w:ascii="Consolas" w:hAnsi="Consolas"/>
+                <w:b w:val="0"/>
+                <w:i w:val="0"/>
+                <w:sz w:val="17"/>
+              </w:rPr>
+              <w:t>ecl_value</w:t>
+            </w:r>
+            <w:r>
+              <w:rPr>
+                <w:b w:val="0"/>
+                <w:i w:val="0"/>
+                <w:sz w:val="17"/>
+              </w:rPr>
+              <w:t xml:space="preserve"> keeps the engine's undiscounted measure and </w:t>
+            </w:r>
+            <w:r>
+              <w:rPr>
+                <w:rFonts w:ascii="Consolas" w:hAnsi="Consolas"/>
+                <w:b w:val="0"/>
+                <w:i w:val="0"/>
+                <w:sz w:val="17"/>
+              </w:rPr>
+              <w:t>ecl_value_discounted</w:t>
+            </w:r>
+            <w:r>
+              <w:rPr>
+                <w:b w:val="0"/>
+                <w:i w:val="0"/>
+                <w:sz w:val="17"/>
+              </w:rPr>
+              <w:t xml:space="preserve"> holds the time-phased allowance discounted at the locked EIR (TimePhasedEclService.php:41-49). The month record, the FLI reports, the build-up and the IFRS 9 note (Ifrs9NoteService.php:192, 220) still read the undiscounted </w:t>
+            </w:r>
+            <w:r>
+              <w:rPr>
+                <w:rFonts w:ascii="Consolas" w:hAnsi="Consolas"/>
+                <w:b w:val="0"/>
+                <w:i w:val="0"/>
+                <w:sz w:val="17"/>
+              </w:rPr>
+              <w:t>ecl_value</w:t>
+            </w:r>
+            <w:r>
+              <w:rPr>
+                <w:b w:val="0"/>
+                <w:i w:val="0"/>
+                <w:sz w:val="17"/>
+              </w:rPr>
+              <w:t xml:space="preserve">; only the dashboard (when every row is discounted) and the ECL screen (uncommitted change) show the discounted figure. In the committed controller the time-phased engine runs only when legacy </w:t>
+            </w:r>
+            <w:r>
+              <w:rPr>
+                <w:rFonts w:ascii="Consolas" w:hAnsi="Consolas"/>
+                <w:b w:val="0"/>
+                <w:i w:val="0"/>
+                <w:sz w:val="17"/>
+              </w:rPr>
+              <w:t>ecl_scenario_assumptions</w:t>
+            </w:r>
+            <w:r>
+              <w:rPr>
+                <w:b w:val="0"/>
+                <w:i w:val="0"/>
+                <w:sz w:val="17"/>
+              </w:rPr>
+              <w:t xml:space="preserve"> are approved, else the single-horizon proxy EclDiscountingService (ExpectedCreditLossController.php:525 at HEAD); the change that also runs it on the governed set written on the loans is uncommitted. Neither database yet holds a discounted month from the new code (maiic_ifrs9_demo August 2026: 0 loans discounted; maiic_ifrs9_results2, built before 216aee2: 62 of 3,826 loans in September 2026).</w:t>
             </w:r>
           </w:p>
         </w:tc>
@@ -1785,7 +2144,23 @@
                 <w:i w:val="0"/>
                 <w:sz w:val="17"/>
               </w:rPr>
-              <w:t xml:space="preserve"> no FLI readiness gate in the checklist</w:t>
+              <w:t xml:space="preserve"> no FLI readiness gate in the checklist. </w:t>
+            </w:r>
+            <w:r>
+              <w:rPr>
+                <w:b/>
+                <w:i w:val="0"/>
+                <w:sz w:val="17"/>
+              </w:rPr>
+              <w:t>Status 14 October 2026:</w:t>
+            </w:r>
+            <w:r>
+              <w:rPr>
+                <w:b w:val="0"/>
+                <w:i w:val="0"/>
+                <w:sz w:val="17"/>
+              </w:rPr>
+              <w:t xml:space="preserve"> the checklist has the FLI step (WorkspaceController.php:35, 113-127), done only when the month is recorded and signed off; the ECL run itself is not gated on it (D-F12).</w:t>
             </w:r>
           </w:p>
         </w:tc>
@@ -1951,7 +2326,40 @@
                 <w:i w:val="0"/>
                 <w:sz w:val="17"/>
               </w:rPr>
-              <w:t xml:space="preserve"> no single snapshot record per ECL run</w:t>
+              <w:t xml:space="preserve"> no single snapshot record per ECL run. </w:t>
+            </w:r>
+            <w:r>
+              <w:rPr>
+                <w:b/>
+                <w:i w:val="0"/>
+                <w:sz w:val="17"/>
+              </w:rPr>
+              <w:t>Status 14 October 2026:</w:t>
+            </w:r>
+            <w:r>
+              <w:rPr>
+                <w:b w:val="0"/>
+                <w:i w:val="0"/>
+                <w:sz w:val="17"/>
+              </w:rPr>
+              <w:t xml:space="preserve"> one </w:t>
+            </w:r>
+            <w:r>
+              <w:rPr>
+                <w:rFonts w:ascii="Consolas" w:hAnsi="Consolas"/>
+                <w:b w:val="0"/>
+                <w:i w:val="0"/>
+                <w:sz w:val="17"/>
+              </w:rPr>
+              <w:t>fli_run_snapshots</w:t>
+            </w:r>
+            <w:r>
+              <w:rPr>
+                <w:b w:val="0"/>
+                <w:i w:val="0"/>
+                <w:sz w:val="17"/>
+              </w:rPr>
+              <w:t xml:space="preserve"> row per recorded month (FliCloseService.php:144-155), without the staging run, the EIR lock or the discounting basis (D-F11).</w:t>
             </w:r>
           </w:p>
         </w:tc>
@@ -2458,6 +2866,73 @@
     </w:p>
     <w:p>
       <w:pPr>
+        <w:spacing w:after="120"/>
+      </w:pPr>
+      <w:r>
+        <w:rPr>
+          <w:b/>
+          <w:i w:val="0"/>
+        </w:rPr>
+        <w:t>Status 14 October 2026:</w:t>
+      </w:r>
+      <w:r>
+        <w:rPr>
+          <w:b w:val="0"/>
+          <w:i w:val="0"/>
+        </w:rPr>
+        <w:t xml:space="preserve"> the month-end job (</w:t>
+      </w:r>
+      <w:r>
+        <w:rPr>
+          <w:rFonts w:ascii="Consolas" w:hAnsi="Consolas"/>
+          <w:b w:val="0"/>
+          <w:i w:val="0"/>
+          <w:sz w:val="18"/>
+        </w:rPr>
+        <w:t>fli:month-end --all</w:t>
+      </w:r>
+      <w:r>
+        <w:rPr>
+          <w:b w:val="0"/>
+          <w:i w:val="0"/>
+        </w:rPr>
+        <w:t xml:space="preserve">) stops when the model version or the scenario set is not in force (FliMonthEndCommand.php:67-74), and the route reads the version in force rather than re-fitting (FliRouteService.php:90-102). The fallback is not removed everywhere: </w:t>
+      </w:r>
+      <w:r>
+        <w:rPr>
+          <w:rFonts w:ascii="Consolas" w:hAnsi="Consolas"/>
+          <w:b w:val="0"/>
+          <w:i w:val="0"/>
+          <w:sz w:val="18"/>
+        </w:rPr>
+        <w:t>FliRouteService::apply</w:t>
+      </w:r>
+      <w:r>
+        <w:rPr>
+          <w:b w:val="0"/>
+          <w:i w:val="0"/>
+        </w:rPr>
+        <w:t xml:space="preserve"> still lets the PD hold when no version is approved (FliRouteService.php:214-219) and </w:t>
+      </w:r>
+      <w:r>
+        <w:rPr>
+          <w:rFonts w:ascii="Consolas" w:hAnsi="Consolas"/>
+          <w:b w:val="0"/>
+          <w:i w:val="0"/>
+          <w:sz w:val="18"/>
+        </w:rPr>
+        <w:t>ifrs9:segment-ecl</w:t>
+      </w:r>
+      <w:r>
+        <w:rPr>
+          <w:b w:val="0"/>
+          <w:i w:val="0"/>
+        </w:rPr>
+        <w:t xml:space="preserve"> accepts that PD, so a run outside the month-end job can book the pre-FLI PD. The fresh bootstrap database maiic_ifrs9_results2 ran that way (0 model versions; every month on "the PD holds").</w:t>
+      </w:r>
+    </w:p>
+    <w:p>
+      <w:pPr>
         <w:pStyle w:val="Heading3"/>
       </w:pPr>
       <w:r>
@@ -2504,6 +2979,41 @@
     </w:p>
     <w:p>
       <w:pPr>
+        <w:spacing w:after="120"/>
+      </w:pPr>
+      <w:r>
+        <w:rPr>
+          <w:b/>
+          <w:i w:val="0"/>
+        </w:rPr>
+        <w:t>Status 14 October 2026:</w:t>
+      </w:r>
+      <w:r>
+        <w:rPr>
+          <w:b w:val="0"/>
+          <w:i w:val="0"/>
+        </w:rPr>
+        <w:t xml:space="preserve"> the registry is built with the states PROPOSED (an external model), PUBLISHED, SUPERSEDED, REJECTED and RETIRED (FliModelRegistry.php:46-161); approving a fit on Regression publishes it at once, so there is no Calibrated or Validated step, and the second person is the fit's approver (FliRouteService.php:63-80). There is one book-level model (</w:t>
+      </w:r>
+      <w:r>
+        <w:rPr>
+          <w:rFonts w:ascii="Consolas" w:hAnsi="Consolas"/>
+          <w:b w:val="0"/>
+          <w:i w:val="0"/>
+          <w:sz w:val="18"/>
+        </w:rPr>
+        <w:t>segment_basis</w:t>
+      </w:r>
+      <w:r>
+        <w:rPr>
+          <w:b w:val="0"/>
+          <w:i w:val="0"/>
+        </w:rPr>
+        <w:t xml:space="preserve"> book); no segment assignment is built.</w:t>
+      </w:r>
+    </w:p>
+    <w:p>
+      <w:pPr>
         <w:pStyle w:val="Heading3"/>
       </w:pPr>
       <w:r>
@@ -2520,6 +3030,73 @@
           <w:i w:val="0"/>
         </w:rPr>
         <w:t>The ECL is computed once per scenario and then weighted: ECL = sum over scenarios of weight x ECL(scenario). Today the weighted stage PD reproduces this exactly because only the PD moves. As soon as the LGD, the EAD or the cash flows vary by scenario, the per-scenario computation is the only correct one. The per-scenario results are stored, so the sensitivity table and the booked allowance come from the same rows.</w:t>
+      </w:r>
+    </w:p>
+    <w:p>
+      <w:pPr>
+        <w:spacing w:after="120"/>
+      </w:pPr>
+      <w:r>
+        <w:rPr>
+          <w:b/>
+          <w:i w:val="0"/>
+        </w:rPr>
+        <w:t>Status 14 October 2026:</w:t>
+      </w:r>
+      <w:r>
+        <w:rPr>
+          <w:b w:val="0"/>
+          <w:i w:val="0"/>
+        </w:rPr>
+        <w:t xml:space="preserve"> FliCloseService::record stores each loan's ECL per scenario in </w:t>
+      </w:r>
+      <w:r>
+        <w:rPr>
+          <w:rFonts w:ascii="Consolas" w:hAnsi="Consolas"/>
+          <w:b w:val="0"/>
+          <w:i w:val="0"/>
+          <w:sz w:val="18"/>
+        </w:rPr>
+        <w:t>ecl_scenario_results</w:t>
+      </w:r>
+      <w:r>
+        <w:rPr>
+          <w:b w:val="0"/>
+          <w:i w:val="0"/>
+        </w:rPr>
+        <w:t xml:space="preserve"> and checks the weighted total against the booked one (FliCloseService.php:77-113), on the engine's undiscounted </w:t>
+      </w:r>
+      <w:r>
+        <w:rPr>
+          <w:rFonts w:ascii="Consolas" w:hAnsi="Consolas"/>
+          <w:b w:val="0"/>
+          <w:i w:val="0"/>
+          <w:sz w:val="18"/>
+        </w:rPr>
+        <w:t>ecl_value</w:t>
+      </w:r>
+      <w:r>
+        <w:rPr>
+          <w:b w:val="0"/>
+          <w:i w:val="0"/>
+        </w:rPr>
+        <w:t>. Since commit 216aee2 the month-end also writes the discounted allowance (</w:t>
+      </w:r>
+      <w:r>
+        <w:rPr>
+          <w:rFonts w:ascii="Consolas" w:hAnsi="Consolas"/>
+          <w:b w:val="0"/>
+          <w:i w:val="0"/>
+          <w:sz w:val="18"/>
+        </w:rPr>
+        <w:t>ecl_value_discounted</w:t>
+      </w:r>
+      <w:r>
+        <w:rPr>
+          <w:b w:val="0"/>
+          <w:i w:val="0"/>
+        </w:rPr>
+        <w:t>) from TimePhasedEclService, which computes and weights the scenarios inside each loan (TimePhasedEclService.php:100-152) and keeps no per-scenario row, so the month record and the sensitivity do not yet read the discounted figure. FliCloseService has no automated test.</w:t>
       </w:r>
     </w:p>
     <w:p>
@@ -2576,6 +3153,57 @@
     </w:p>
     <w:p>
       <w:pPr>
+        <w:spacing w:after="120"/>
+      </w:pPr>
+      <w:r>
+        <w:rPr>
+          <w:b/>
+          <w:i w:val="0"/>
+        </w:rPr>
+        <w:t>Status 14 October 2026:</w:t>
+      </w:r>
+      <w:r>
+        <w:rPr>
+          <w:b w:val="0"/>
+          <w:i w:val="0"/>
+        </w:rPr>
+        <w:t xml:space="preserve"> partly built, in two places that do not meet. FliProjectionService projects per portfolio and per scenario the year-by-year PD, survival and marginal PD, with reversion after the governed horizon (</w:t>
+      </w:r>
+      <w:r>
+        <w:rPr>
+          <w:rFonts w:ascii="Consolas" w:hAnsi="Consolas"/>
+          <w:b w:val="0"/>
+          <w:i w:val="0"/>
+          <w:sz w:val="18"/>
+        </w:rPr>
+        <w:t>fli_forecast_horizon</w:t>
+      </w:r>
+      <w:r>
+        <w:rPr>
+          <w:b w:val="0"/>
+          <w:i w:val="0"/>
+        </w:rPr>
+        <w:t xml:space="preserve">), as evidence only: the booked Stage 2 ECL does not use it (FliProjectionService.php:14-38). TimePhasedEclService measures the discounted allowance loan by loan, month by month, with survival, but from one constant hazard per scenario derived from the scenario's twelve-month PD (TimePhasedEclService.php:109-120), not a year-by-year path from the model with reversion. The undiscounted </w:t>
+      </w:r>
+      <w:r>
+        <w:rPr>
+          <w:rFonts w:ascii="Consolas" w:hAnsi="Consolas"/>
+          <w:b w:val="0"/>
+          <w:i w:val="0"/>
+          <w:sz w:val="18"/>
+        </w:rPr>
+        <w:t>ecl_value</w:t>
+      </w:r>
+      <w:r>
+        <w:rPr>
+          <w:b w:val="0"/>
+          <w:i w:val="0"/>
+        </w:rPr>
+        <w:t xml:space="preserve"> still uses 1 - (1 - PD12)^(months/12).</w:t>
+      </w:r>
+    </w:p>
+    <w:p>
+      <w:pPr>
         <w:pStyle w:val="Heading3"/>
       </w:pPr>
       <w:r>
@@ -2592,6 +3220,41 @@
           <w:i w:val="0"/>
         </w:rPr>
         <w:t>Stage 3 is not given a PD. Its loss is the shortfall of expected recoveries, discounted at the EIR, where recoveries are modelled loan by loan; otherwise EAD x LGD at the reporting date. Scenarios may move the size and the timing of recoveries (the LGD and the time to realise collateral), never the fact of default. A collateral benefit counted in the LGD is not deducted again.</w:t>
+      </w:r>
+    </w:p>
+    <w:p>
+      <w:pPr>
+        <w:spacing w:after="120"/>
+      </w:pPr>
+      <w:r>
+        <w:rPr>
+          <w:b/>
+          <w:i w:val="0"/>
+        </w:rPr>
+        <w:t>Status 14 October 2026:</w:t>
+      </w:r>
+      <w:r>
+        <w:rPr>
+          <w:b w:val="0"/>
+          <w:i w:val="0"/>
+        </w:rPr>
+        <w:t xml:space="preserve"> built for the discounted allowance in TimePhasedEclService::stageThree (the shortfall of approved recoveries in </w:t>
+      </w:r>
+      <w:r>
+        <w:rPr>
+          <w:rFonts w:ascii="Consolas" w:hAnsi="Consolas"/>
+          <w:b w:val="0"/>
+          <w:i w:val="0"/>
+          <w:sz w:val="18"/>
+        </w:rPr>
+        <w:t>ecl_recovery_cashflows</w:t>
+      </w:r>
+      <w:r>
+        <w:rPr>
+          <w:b w:val="0"/>
+          <w:i w:val="0"/>
+        </w:rPr>
+        <w:t>, each discounted at the EIR from its own date; with no plan, EAD x LGD at the reporting date and no EIR needed), tested in TimePhasedEclServiceTest (the three Stage 3 tests); the month record holds Stage 3 at its booked ECL in every scenario (FliCloseService.php:91-94). No recovery plan is held in either database, so every Stage 3 loan is EAD x LGD. Scenario-dependent recoveries wait on question 4 (D-F8).</w:t>
       </w:r>
     </w:p>
     <w:p>
@@ -2958,6 +3621,25 @@
     </w:p>
     <w:p>
       <w:pPr>
+        <w:spacing w:after="120"/>
+      </w:pPr>
+      <w:r>
+        <w:rPr>
+          <w:b/>
+          <w:i w:val="0"/>
+        </w:rPr>
+        <w:t>Status 14 October 2026:</w:t>
+      </w:r>
+      <w:r>
+        <w:rPr>
+          <w:b w:val="0"/>
+          <w:i w:val="0"/>
+        </w:rPr>
+        <w:t xml:space="preserve"> the stationarity check is evidence, not a gate: Diagnostics runs a Dickey-Fuller test on each side and recommends first differences (Diagnostics.php:105-135), but the Guardrail declines a fit only on observations, sign, R-squared and p-value (Guardrail.php:95-106), so a non-stationary levels fit can still be applied. The external (industry) series route is built in the bridge (EXT_ measures), with no automated test and no external series held in either database.</w:t>
+      </w:r>
+    </w:p>
+    <w:p>
+      <w:pPr>
         <w:pStyle w:val="Heading3"/>
       </w:pPr>
       <w:r>
@@ -3018,6 +3700,73 @@
     </w:p>
     <w:p>
       <w:pPr>
+        <w:spacing w:after="120"/>
+      </w:pPr>
+      <w:r>
+        <w:rPr>
+          <w:b/>
+          <w:i w:val="0"/>
+        </w:rPr>
+        <w:t>Status 14 October 2026:</w:t>
+      </w:r>
+      <w:r>
+        <w:rPr>
+          <w:b w:val="0"/>
+          <w:i w:val="0"/>
+        </w:rPr>
+        <w:t xml:space="preserve"> partly built. </w:t>
+      </w:r>
+      <w:r>
+        <w:rPr>
+          <w:rFonts w:ascii="Consolas" w:hAnsi="Consolas"/>
+          <w:b w:val="0"/>
+          <w:i w:val="0"/>
+          <w:sz w:val="18"/>
+        </w:rPr>
+        <w:t>published_at</w:t>
+      </w:r>
+      <w:r>
+        <w:rPr>
+          <w:b w:val="0"/>
+          <w:i w:val="0"/>
+        </w:rPr>
+        <w:t xml:space="preserve"> exists on </w:t>
+      </w:r>
+      <w:r>
+        <w:rPr>
+          <w:rFonts w:ascii="Consolas" w:hAnsi="Consolas"/>
+          <w:b w:val="0"/>
+          <w:i w:val="0"/>
+          <w:sz w:val="18"/>
+        </w:rPr>
+        <w:t>macro_statistics_data</w:t>
+      </w:r>
+      <w:r>
+        <w:rPr>
+          <w:b w:val="0"/>
+          <w:i w:val="0"/>
+        </w:rPr>
+        <w:t xml:space="preserve"> and </w:t>
+      </w:r>
+      <w:r>
+        <w:rPr>
+          <w:rFonts w:ascii="Consolas" w:hAnsi="Consolas"/>
+          <w:b w:val="0"/>
+          <w:i w:val="0"/>
+          <w:sz w:val="18"/>
+        </w:rPr>
+        <w:t>macro_credit_loss_data</w:t>
+      </w:r>
+      <w:r>
+        <w:rPr>
+          <w:b w:val="0"/>
+          <w:i w:val="0"/>
+        </w:rPr>
+        <w:t xml:space="preserve"> (migration 2026_10_13_100000) and the as-at reader honours it, with the publication lag where it is blank. A revised value still replaces the earlier one in place (MacroImportService.php:82-84; a correction on screen, MacroStatisticsController.php:223-227, keeps the old value only in the audit log), so the October forecast does overwrite the March one. 0 of 261 observations carry a release date in maiic_ifrs9_demo or maiic_ifrs9_results2.</w:t>
+      </w:r>
+    </w:p>
+    <w:p>
+      <w:pPr>
         <w:pStyle w:val="Heading3"/>
       </w:pPr>
       <w:r>
@@ -3034,6 +3783,57 @@
           <w:i w:val="0"/>
         </w:rPr>
         <w:t>Each official ECL run records, in one row: the loan book build, the staging run, the segment PD/LGD run, the FLI model version, the scenario set and version, the overlays applied, the EIR lock, the discounting basis and the macro vintage. A reviewer of 31 October 2026 can then rebuild that month's figure with nothing revised later.</w:t>
+      </w:r>
+    </w:p>
+    <w:p>
+      <w:pPr>
+        <w:spacing w:after="120"/>
+      </w:pPr>
+      <w:r>
+        <w:rPr>
+          <w:b/>
+          <w:i w:val="0"/>
+        </w:rPr>
+        <w:t>Status 14 October 2026:</w:t>
+      </w:r>
+      <w:r>
+        <w:rPr>
+          <w:b w:val="0"/>
+          <w:i w:val="0"/>
+        </w:rPr>
+        <w:t xml:space="preserve"> partly built. One </w:t>
+      </w:r>
+      <w:r>
+        <w:rPr>
+          <w:rFonts w:ascii="Consolas" w:hAnsi="Consolas"/>
+          <w:b w:val="0"/>
+          <w:i w:val="0"/>
+          <w:sz w:val="18"/>
+        </w:rPr>
+        <w:t>fli_run_snapshots</w:t>
+      </w:r>
+      <w:r>
+        <w:rPr>
+          <w:b w:val="0"/>
+          <w:i w:val="0"/>
+        </w:rPr>
+        <w:t xml:space="preserve"> row per recorded month holds the model version, the scenario set and version, the overlays, a macro vintage label, the PD segment runs, the ECL runs and the loan-book loads (FliCloseService.php:128-155). It does not record the staging run, the EIR lock or the discounting basis, and its booked figure is the undiscounted </w:t>
+      </w:r>
+      <w:r>
+        <w:rPr>
+          <w:rFonts w:ascii="Consolas" w:hAnsi="Consolas"/>
+          <w:b w:val="0"/>
+          <w:i w:val="0"/>
+          <w:sz w:val="18"/>
+        </w:rPr>
+        <w:t>ecl_value</w:t>
+      </w:r>
+      <w:r>
+        <w:rPr>
+          <w:b w:val="0"/>
+          <w:i w:val="0"/>
+        </w:rPr>
+        <w:t>. Because revisions overwrite (D-F10), the vintage it names cannot be re-read. maiic_ifrs9_demo holds one current record (August 2026, RECORDED, not signed off); maiic_ifrs9_results2 holds none.</w:t>
       </w:r>
     </w:p>
     <w:p>
@@ -3058,6 +3858,41 @@
     </w:p>
     <w:p>
       <w:pPr>
+        <w:spacing w:after="120"/>
+      </w:pPr>
+      <w:r>
+        <w:rPr>
+          <w:b/>
+          <w:i w:val="0"/>
+        </w:rPr>
+        <w:t>Status 14 October 2026:</w:t>
+      </w:r>
+      <w:r>
+        <w:rPr>
+          <w:b w:val="0"/>
+          <w:i w:val="0"/>
+        </w:rPr>
+        <w:t xml:space="preserve"> partly built. The checklist step is built (WorkspaceController.php:35, 113-127), the month-end job stops before the ECL without a version and a set (FliMonthEndCommand.php:67-74), and the month record refuses an ECL not on the post-FLI PD or older than the route (FliCloseService.php:47-55). The ECL run itself does not refuse: </w:t>
+      </w:r>
+      <w:r>
+        <w:rPr>
+          <w:rFonts w:ascii="Consolas" w:hAnsi="Consolas"/>
+          <w:b w:val="0"/>
+          <w:i w:val="0"/>
+          <w:sz w:val="18"/>
+        </w:rPr>
+        <w:t>ifrs9:segment-ecl</w:t>
+      </w:r>
+      <w:r>
+        <w:rPr>
+          <w:b w:val="0"/>
+          <w:i w:val="0"/>
+        </w:rPr>
+        <w:t xml:space="preserve"> checks only that each exposed loan has a stage, a post-FLI PD and an LGD (SegmentEcl.php:113-141), not that the route ran under the version and the set in force, and the ECL screen's calculation has no FLI check.</w:t>
+      </w:r>
+    </w:p>
+    <w:p>
+      <w:pPr>
         <w:pStyle w:val="Heading3"/>
       </w:pPr>
       <w:r>
@@ -3074,6 +3909,25 @@
           <w:i w:val="0"/>
         </w:rPr>
         <w:t>The proposal of section 4 drew a new set of tabs. Edward's direction on 13 October was not to remove what MAIIC already uses: every earlier forward-looking screen (Macro Statistics, Credit Loss Data, Correlation Finder, Regression, Adjusted Forecast, Weighted Forecast, Scenario Profiles, Scenario Sets, Economic Scenarios, Manual Overlays, External Calculations, Calculation History) comes back to its place, out of the old Legacy section, and the new pieces (Overview, Impact Analysis, Model Versions) join them. Each screen became a working step of the governed chain rather than a separate tool, and a user can start and finish the month from the screens alone. Section 4 is updated to the menu as built.</w:t>
+      </w:r>
+    </w:p>
+    <w:p>
+      <w:pPr>
+        <w:spacing w:after="120"/>
+      </w:pPr>
+      <w:r>
+        <w:rPr>
+          <w:b/>
+          <w:i w:val="0"/>
+        </w:rPr>
+        <w:t>Status 14 October 2026:</w:t>
+      </w:r>
+      <w:r>
+        <w:rPr>
+          <w:b w:val="0"/>
+          <w:i w:val="0"/>
+        </w:rPr>
+        <w:t xml:space="preserve"> the menu is built and tested (NavigationTest::test_the_forward_looking_menu_is_one_entry_in_month_end_order). No month has yet been finished, that is signed off, on either database.</w:t>
       </w:r>
     </w:p>
     <w:p>
@@ -3217,6 +4071,57 @@
     </w:p>
     <w:p>
       <w:pPr>
+        <w:spacing w:after="120"/>
+      </w:pPr>
+      <w:r>
+        <w:rPr>
+          <w:b/>
+          <w:i w:val="0"/>
+        </w:rPr>
+        <w:t>Status 14 October 2026:</w:t>
+      </w:r>
+      <w:r>
+        <w:rPr>
+          <w:b w:val="0"/>
+          <w:i w:val="0"/>
+        </w:rPr>
+        <w:t xml:space="preserve"> built (Ifrs9ReportsController reads </w:t>
+      </w:r>
+      <w:r>
+        <w:rPr>
+          <w:rFonts w:ascii="Consolas" w:hAnsi="Consolas"/>
+          <w:b w:val="0"/>
+          <w:i w:val="0"/>
+          <w:sz w:val="18"/>
+        </w:rPr>
+        <w:t>fli_run_snapshots</w:t>
+      </w:r>
+      <w:r>
+        <w:rPr>
+          <w:b w:val="0"/>
+          <w:i w:val="0"/>
+        </w:rPr>
+        <w:t xml:space="preserve">; EclProjectionController.php:14 leaves out the </w:t>
+      </w:r>
+      <w:r>
+        <w:rPr>
+          <w:rFonts w:ascii="Consolas" w:hAnsi="Consolas"/>
+          <w:b w:val="0"/>
+          <w:i w:val="0"/>
+          <w:sz w:val="18"/>
+        </w:rPr>
+        <w:t>fli-projection</w:t>
+      </w:r>
+      <w:r>
+        <w:rPr>
+          <w:b w:val="0"/>
+          <w:i w:val="0"/>
+        </w:rPr>
+        <w:t xml:space="preserve"> runs). Since the month-end became discounted (commit 216aee2), the "booked" ECL these reports show is the undiscounted engine measure, not the discounted allowance.</w:t>
+      </w:r>
+    </w:p>
+    <w:p>
+      <w:pPr>
         <w:pStyle w:val="Heading3"/>
       </w:pPr>
       <w:r>
@@ -3248,7 +4153,58 @@
           <w:b w:val="0"/>
           <w:i w:val="0"/>
         </w:rPr>
-        <w:t>), the ledger cash, the EIR revenue run, and the Mega Farm ECL where there are such loans. The Overview's own Run buttons start the same steps one at a time in the background.</w:t>
+        <w:t>), the ledger cash, the EIR revenue run, and the Mega Farm ECL where there are such loans. The Overview's own Run buttons start the forward-looking steps one at a time in the background (corrected 14 October 2026; it said "start the same steps"): the correlation sweep, the route, the projection, the ECL, the record and the whole forward-looking chain (FliModuleController.php:32-39), not the staging, PD, ledger cash, revenue or Mega Farm steps.</w:t>
+      </w:r>
+    </w:p>
+    <w:p>
+      <w:pPr>
+        <w:spacing w:after="120"/>
+      </w:pPr>
+      <w:r>
+        <w:rPr>
+          <w:b/>
+          <w:i w:val="0"/>
+        </w:rPr>
+        <w:t>Status 14 October 2026:</w:t>
+      </w:r>
+      <w:r>
+        <w:rPr>
+          <w:b w:val="0"/>
+          <w:i w:val="0"/>
+        </w:rPr>
+        <w:t xml:space="preserve"> commit 216aee2 added a step after linking the clients, "Programme portfolios" (</w:t>
+      </w:r>
+      <w:r>
+        <w:rPr>
+          <w:rFonts w:ascii="Consolas" w:hAnsi="Consolas"/>
+          <w:b w:val="0"/>
+          <w:i w:val="0"/>
+          <w:sz w:val="18"/>
+        </w:rPr>
+        <w:t>ifrs9:segment-portfolios</w:t>
+      </w:r>
+      <w:r>
+        <w:rPr>
+          <w:b w:val="0"/>
+          <w:i w:val="0"/>
+        </w:rPr>
+        <w:t xml:space="preserve">, which keeps the Mega Farm schemes apart from the MAIIC book), and the ECL inside </w:t>
+      </w:r>
+      <w:r>
+        <w:rPr>
+          <w:rFonts w:ascii="Consolas" w:hAnsi="Consolas"/>
+          <w:b w:val="0"/>
+          <w:i w:val="0"/>
+          <w:sz w:val="18"/>
+        </w:rPr>
+        <w:t>fli:month-end --all</w:t>
+      </w:r>
+      <w:r>
+        <w:rPr>
+          <w:b w:val="0"/>
+          <w:i w:val="0"/>
+        </w:rPr>
+        <w:t xml:space="preserve"> is now discounted at the EIR (MaintenanceTask.php:43-52; FliMonthEndCommand.php:85). The seven Maintenance jobs are bootstrap, update, build the loan book, month-end, recalibrate the forward-looking model, fetch new data and check the system (MaintenanceController.php:37-87).</w:t>
       </w:r>
     </w:p>
     <w:p>
@@ -4422,7 +5378,125 @@
                 <w:i w:val="0"/>
                 <w:sz w:val="17"/>
               </w:rPr>
-              <w:t xml:space="preserve"> (actual, estimate, forecast) where missing</w:t>
+              <w:t xml:space="preserve"> (actual, estimate, forecast) where missing. </w:t>
+            </w:r>
+            <w:r>
+              <w:rPr>
+                <w:b/>
+                <w:i w:val="0"/>
+                <w:sz w:val="17"/>
+              </w:rPr>
+              <w:t>Status 14 October 2026:</w:t>
+            </w:r>
+            <w:r>
+              <w:rPr>
+                <w:b w:val="0"/>
+                <w:i w:val="0"/>
+                <w:sz w:val="17"/>
+              </w:rPr>
+              <w:t xml:space="preserve"> </w:t>
+            </w:r>
+            <w:r>
+              <w:rPr>
+                <w:rFonts w:ascii="Consolas" w:hAnsi="Consolas"/>
+                <w:b w:val="0"/>
+                <w:i w:val="0"/>
+                <w:sz w:val="17"/>
+              </w:rPr>
+              <w:t>published_at</w:t>
+            </w:r>
+            <w:r>
+              <w:rPr>
+                <w:b w:val="0"/>
+                <w:i w:val="0"/>
+                <w:sz w:val="17"/>
+              </w:rPr>
+              <w:t xml:space="preserve"> added to </w:t>
+            </w:r>
+            <w:r>
+              <w:rPr>
+                <w:rFonts w:ascii="Consolas" w:hAnsi="Consolas"/>
+                <w:b w:val="0"/>
+                <w:i w:val="0"/>
+                <w:sz w:val="17"/>
+              </w:rPr>
+              <w:t>macro_statistics_data</w:t>
+            </w:r>
+            <w:r>
+              <w:rPr>
+                <w:b w:val="0"/>
+                <w:i w:val="0"/>
+                <w:sz w:val="17"/>
+              </w:rPr>
+              <w:t xml:space="preserve"> and </w:t>
+            </w:r>
+            <w:r>
+              <w:rPr>
+                <w:rFonts w:ascii="Consolas" w:hAnsi="Consolas"/>
+                <w:b w:val="0"/>
+                <w:i w:val="0"/>
+                <w:sz w:val="17"/>
+              </w:rPr>
+              <w:t>macro_credit_loss_data</w:t>
+            </w:r>
+            <w:r>
+              <w:rPr>
+                <w:b w:val="0"/>
+                <w:i w:val="0"/>
+                <w:sz w:val="17"/>
+              </w:rPr>
+              <w:t xml:space="preserve">; </w:t>
+            </w:r>
+            <w:r>
+              <w:rPr>
+                <w:rFonts w:ascii="Consolas" w:hAnsi="Consolas"/>
+                <w:b w:val="0"/>
+                <w:i w:val="0"/>
+                <w:sz w:val="17"/>
+              </w:rPr>
+              <w:t>macro_series</w:t>
+            </w:r>
+            <w:r>
+              <w:rPr>
+                <w:b w:val="0"/>
+                <w:i w:val="0"/>
+                <w:sz w:val="17"/>
+              </w:rPr>
+              <w:t xml:space="preserve"> carries </w:t>
+            </w:r>
+            <w:r>
+              <w:rPr>
+                <w:rFonts w:ascii="Consolas" w:hAnsi="Consolas"/>
+                <w:b w:val="0"/>
+                <w:i w:val="0"/>
+                <w:sz w:val="17"/>
+              </w:rPr>
+              <w:t>vintage</w:t>
+            </w:r>
+            <w:r>
+              <w:rPr>
+                <w:b w:val="0"/>
+                <w:i w:val="0"/>
+                <w:sz w:val="17"/>
+              </w:rPr>
+              <w:t xml:space="preserve"> and </w:t>
+            </w:r>
+            <w:r>
+              <w:rPr>
+                <w:rFonts w:ascii="Consolas" w:hAnsi="Consolas"/>
+                <w:b w:val="0"/>
+                <w:i w:val="0"/>
+                <w:sz w:val="17"/>
+              </w:rPr>
+              <w:t>value_type</w:t>
+            </w:r>
+            <w:r>
+              <w:rPr>
+                <w:b w:val="0"/>
+                <w:i w:val="0"/>
+                <w:sz w:val="17"/>
+              </w:rPr>
+              <w:t>; no earlier vintage is kept on a revision</w:t>
             </w:r>
           </w:p>
         </w:tc>
@@ -4796,7 +5870,23 @@
                 <w:i w:val="0"/>
                 <w:sz w:val="17"/>
               </w:rPr>
-              <w:t xml:space="preserve"> model (target metric, segment, method), version (coefficients, lags, diagnostics, lifecycle status, effective date, approvals), linked to the fit it came from</w:t>
+              <w:t xml:space="preserve"> model (target metric, segment, method), version (coefficients, lags, diagnostics, lifecycle status, effective date, approvals), linked to the fit it came from. </w:t>
+            </w:r>
+            <w:r>
+              <w:rPr>
+                <w:b/>
+                <w:i w:val="0"/>
+                <w:sz w:val="17"/>
+              </w:rPr>
+              <w:t>Status 14 October 2026:</w:t>
+            </w:r>
+            <w:r>
+              <w:rPr>
+                <w:b w:val="0"/>
+                <w:i w:val="0"/>
+                <w:sz w:val="17"/>
+              </w:rPr>
+              <w:t xml:space="preserve"> built (migration 2026_10_13_100000), with one book-level model</w:t>
             </w:r>
           </w:p>
         </w:tc>
@@ -4870,7 +5960,23 @@
                 <w:i w:val="0"/>
                 <w:sz w:val="17"/>
               </w:rPr>
-              <w:t xml:space="preserve"> segment to model version, effective date</w:t>
+              <w:t xml:space="preserve"> segment to model version, effective date. </w:t>
+            </w:r>
+            <w:r>
+              <w:rPr>
+                <w:b/>
+                <w:i w:val="0"/>
+                <w:sz w:val="17"/>
+              </w:rPr>
+              <w:t>Status 14 October 2026:</w:t>
+            </w:r>
+            <w:r>
+              <w:rPr>
+                <w:b w:val="0"/>
+                <w:i w:val="0"/>
+                <w:sz w:val="17"/>
+              </w:rPr>
+              <w:t xml:space="preserve"> not built; no such table or migration</w:t>
             </w:r>
           </w:p>
         </w:tc>
@@ -4936,7 +6042,40 @@
                 <w:i w:val="0"/>
                 <w:sz w:val="17"/>
               </w:rPr>
-              <w:t>Add the risk covered and the double-counting review</w:t>
+              <w:t xml:space="preserve">Add the risk covered and the double-counting review. </w:t>
+            </w:r>
+            <w:r>
+              <w:rPr>
+                <w:b/>
+                <w:i w:val="0"/>
+                <w:sz w:val="17"/>
+              </w:rPr>
+              <w:t>Status 14 October 2026:</w:t>
+            </w:r>
+            <w:r>
+              <w:rPr>
+                <w:b w:val="0"/>
+                <w:i w:val="0"/>
+                <w:sz w:val="17"/>
+              </w:rPr>
+              <w:t xml:space="preserve"> built (</w:t>
+            </w:r>
+            <w:r>
+              <w:rPr>
+                <w:rFonts w:ascii="Consolas" w:hAnsi="Consolas"/>
+                <w:b w:val="0"/>
+                <w:i w:val="0"/>
+                <w:sz w:val="17"/>
+              </w:rPr>
+              <w:t>risk_driver</w:t>
+            </w:r>
+            <w:r>
+              <w:rPr>
+                <w:b w:val="0"/>
+                <w:i w:val="0"/>
+                <w:sz w:val="17"/>
+              </w:rPr>
+              <w:t>, double-count review)</w:t>
             </w:r>
           </w:p>
         </w:tc>
@@ -5053,7 +6192,40 @@
                 <w:i w:val="0"/>
                 <w:sz w:val="17"/>
               </w:rPr>
-              <w:t>Use (they exist, empty)</w:t>
+              <w:t xml:space="preserve">Use (they exist, empty). </w:t>
+            </w:r>
+            <w:r>
+              <w:rPr>
+                <w:b/>
+                <w:i w:val="0"/>
+                <w:sz w:val="17"/>
+              </w:rPr>
+              <w:t>Status 14 October 2026:</w:t>
+            </w:r>
+            <w:r>
+              <w:rPr>
+                <w:b w:val="0"/>
+                <w:i w:val="0"/>
+                <w:sz w:val="17"/>
+              </w:rPr>
+              <w:t xml:space="preserve"> written by FliProjectionService (portfolio evidence) and TimePhasedEclService (loan-level, discounted run); </w:t>
+            </w:r>
+            <w:r>
+              <w:rPr>
+                <w:rFonts w:ascii="Consolas" w:hAnsi="Consolas"/>
+                <w:b w:val="0"/>
+                <w:i w:val="0"/>
+                <w:sz w:val="17"/>
+              </w:rPr>
+              <w:t>ecl_recovery_cashflows</w:t>
+            </w:r>
+            <w:r>
+              <w:rPr>
+                <w:b w:val="0"/>
+                <w:i w:val="0"/>
+                <w:sz w:val="17"/>
+              </w:rPr>
+              <w:t xml:space="preserve"> is still empty</w:t>
             </w:r>
           </w:p>
         </w:tc>
@@ -5127,7 +6299,40 @@
                 <w:i w:val="0"/>
                 <w:sz w:val="17"/>
               </w:rPr>
-              <w:t xml:space="preserve"> loan, run, scenario, stage, ECL undiscounted and discounted</w:t>
+              <w:t xml:space="preserve"> loan, run, scenario, stage, ECL undiscounted and discounted. </w:t>
+            </w:r>
+            <w:r>
+              <w:rPr>
+                <w:b/>
+                <w:i w:val="0"/>
+                <w:sz w:val="17"/>
+              </w:rPr>
+              <w:t>Status 14 October 2026:</w:t>
+            </w:r>
+            <w:r>
+              <w:rPr>
+                <w:b w:val="0"/>
+                <w:i w:val="0"/>
+                <w:sz w:val="17"/>
+              </w:rPr>
+              <w:t xml:space="preserve"> built with one ECL column, the undiscounted engine measure (plus weight, pd12 and stage_pd), keyed to the month record (</w:t>
+            </w:r>
+            <w:r>
+              <w:rPr>
+                <w:rFonts w:ascii="Consolas" w:hAnsi="Consolas"/>
+                <w:b w:val="0"/>
+                <w:i w:val="0"/>
+                <w:sz w:val="17"/>
+              </w:rPr>
+              <w:t>snapshot_id</w:t>
+            </w:r>
+            <w:r>
+              <w:rPr>
+                <w:b w:val="0"/>
+                <w:i w:val="0"/>
+                <w:sz w:val="17"/>
+              </w:rPr>
+              <w:t>); no discounted column</w:t>
             </w:r>
           </w:p>
         </w:tc>
@@ -5210,7 +6415,91 @@
                 <w:i w:val="0"/>
                 <w:sz w:val="17"/>
               </w:rPr>
-              <w:t>Keep</w:t>
+              <w:t xml:space="preserve">Keep. </w:t>
+            </w:r>
+            <w:r>
+              <w:rPr>
+                <w:b/>
+                <w:i w:val="0"/>
+                <w:sz w:val="17"/>
+              </w:rPr>
+              <w:t>Status 14 October 2026:</w:t>
+            </w:r>
+            <w:r>
+              <w:rPr>
+                <w:b w:val="0"/>
+                <w:i w:val="0"/>
+                <w:sz w:val="17"/>
+              </w:rPr>
+              <w:t xml:space="preserve"> both now carry the undiscounted and the discounted figure (</w:t>
+            </w:r>
+            <w:r>
+              <w:rPr>
+                <w:rFonts w:ascii="Consolas" w:hAnsi="Consolas"/>
+                <w:b w:val="0"/>
+                <w:i w:val="0"/>
+                <w:sz w:val="17"/>
+              </w:rPr>
+              <w:t>ecl_value</w:t>
+            </w:r>
+            <w:r>
+              <w:rPr>
+                <w:b w:val="0"/>
+                <w:i w:val="0"/>
+                <w:sz w:val="17"/>
+              </w:rPr>
+              <w:t xml:space="preserve"> and </w:t>
+            </w:r>
+            <w:r>
+              <w:rPr>
+                <w:rFonts w:ascii="Consolas" w:hAnsi="Consolas"/>
+                <w:b w:val="0"/>
+                <w:i w:val="0"/>
+                <w:sz w:val="17"/>
+              </w:rPr>
+              <w:t>ecl_value_discounted</w:t>
+            </w:r>
+            <w:r>
+              <w:rPr>
+                <w:b w:val="0"/>
+                <w:i w:val="0"/>
+                <w:sz w:val="17"/>
+              </w:rPr>
+              <w:t xml:space="preserve">; </w:t>
+            </w:r>
+            <w:r>
+              <w:rPr>
+                <w:rFonts w:ascii="Consolas" w:hAnsi="Consolas"/>
+                <w:b w:val="0"/>
+                <w:i w:val="0"/>
+                <w:sz w:val="17"/>
+              </w:rPr>
+              <w:t>total_ecl</w:t>
+            </w:r>
+            <w:r>
+              <w:rPr>
+                <w:b w:val="0"/>
+                <w:i w:val="0"/>
+                <w:sz w:val="17"/>
+              </w:rPr>
+              <w:t xml:space="preserve"> and </w:t>
+            </w:r>
+            <w:r>
+              <w:rPr>
+                <w:rFonts w:ascii="Consolas" w:hAnsi="Consolas"/>
+                <w:b w:val="0"/>
+                <w:i w:val="0"/>
+                <w:sz w:val="17"/>
+              </w:rPr>
+              <w:t>total_ecl_discounted</w:t>
+            </w:r>
+            <w:r>
+              <w:rPr>
+                <w:b w:val="0"/>
+                <w:i w:val="0"/>
+                <w:sz w:val="17"/>
+              </w:rPr>
+              <w:t>)</w:t>
             </w:r>
           </w:p>
         </w:tc>
@@ -5284,7 +6573,49 @@
                 <w:i w:val="0"/>
                 <w:sz w:val="17"/>
               </w:rPr>
-              <w:t xml:space="preserve"> (D-F11)</w:t>
+              <w:t xml:space="preserve"> (D-F11). </w:t>
+            </w:r>
+            <w:r>
+              <w:rPr>
+                <w:b/>
+                <w:i w:val="0"/>
+                <w:sz w:val="17"/>
+              </w:rPr>
+              <w:t>Status 14 October 2026:</w:t>
+            </w:r>
+            <w:r>
+              <w:rPr>
+                <w:b w:val="0"/>
+                <w:i w:val="0"/>
+                <w:sz w:val="17"/>
+              </w:rPr>
+              <w:t xml:space="preserve"> built as </w:t>
+            </w:r>
+            <w:r>
+              <w:rPr>
+                <w:rFonts w:ascii="Consolas" w:hAnsi="Consolas"/>
+                <w:b w:val="0"/>
+                <w:i w:val="0"/>
+                <w:sz w:val="17"/>
+              </w:rPr>
+              <w:t>fli_run_snapshots</w:t>
+            </w:r>
+            <w:r>
+              <w:rPr>
+                <w:b w:val="0"/>
+                <w:i w:val="0"/>
+                <w:sz w:val="17"/>
+              </w:rPr>
+              <w:t xml:space="preserve">, not </w:t>
+            </w:r>
+            <w:r>
+              <w:rPr>
+                <w:rFonts w:ascii="Consolas" w:hAnsi="Consolas"/>
+                <w:b w:val="0"/>
+                <w:i w:val="0"/>
+                <w:sz w:val="17"/>
+              </w:rPr>
+              <w:t>ecl_run_snapshots</w:t>
             </w:r>
           </w:p>
         </w:tc>
@@ -5440,7 +6771,40 @@
                 <w:i w:val="0"/>
                 <w:sz w:val="17"/>
               </w:rPr>
-              <w:t>Observations and vintages as known at the reporting date (D-F10)</w:t>
+              <w:t xml:space="preserve">Observations and vintages as known at the reporting date (D-F10). </w:t>
+            </w:r>
+            <w:r>
+              <w:rPr>
+                <w:b/>
+                <w:i w:val="0"/>
+                <w:sz w:val="17"/>
+              </w:rPr>
+              <w:t>Status 14 October 2026:</w:t>
+            </w:r>
+            <w:r>
+              <w:rPr>
+                <w:b w:val="0"/>
+                <w:i w:val="0"/>
+                <w:sz w:val="17"/>
+              </w:rPr>
+              <w:t xml:space="preserve"> AsAtSeries honours </w:t>
+            </w:r>
+            <w:r>
+              <w:rPr>
+                <w:rFonts w:ascii="Consolas" w:hAnsi="Consolas"/>
+                <w:b w:val="0"/>
+                <w:i w:val="0"/>
+                <w:sz w:val="17"/>
+              </w:rPr>
+              <w:t>published_at</w:t>
+            </w:r>
+            <w:r>
+              <w:rPr>
+                <w:b w:val="0"/>
+                <w:i w:val="0"/>
+                <w:sz w:val="17"/>
+              </w:rPr>
+              <w:t xml:space="preserve"> and the lag; MacroImportService still overwrites a revised value (MacroImportService.php:82-84), so it keeps no vintages</w:t>
             </w:r>
           </w:p>
         </w:tc>
@@ -5564,7 +6928,23 @@
                 <w:i w:val="0"/>
                 <w:sz w:val="17"/>
               </w:rPr>
-              <w:t>Calibration evidence, with the stationarity check (D-F7)</w:t>
+              <w:t xml:space="preserve">Calibration evidence, with the stationarity check (D-F7). </w:t>
+            </w:r>
+            <w:r>
+              <w:rPr>
+                <w:b/>
+                <w:i w:val="0"/>
+                <w:sz w:val="17"/>
+              </w:rPr>
+              <w:t>Status 14 October 2026:</w:t>
+            </w:r>
+            <w:r>
+              <w:rPr>
+                <w:b w:val="0"/>
+                <w:i w:val="0"/>
+                <w:sz w:val="17"/>
+              </w:rPr>
+              <w:t xml:space="preserve"> the stationarity test is reported by Diagnostics; the Guardrail does not decline on it</w:t>
             </w:r>
           </w:p>
         </w:tc>
@@ -5617,7 +6997,23 @@
                 <w:i w:val="0"/>
                 <w:sz w:val="17"/>
               </w:rPr>
-              <w:t>Promotes an approved fit to a model version; resolves the version in force for a segment and date (D-F2)</w:t>
+              <w:t xml:space="preserve">Promotes an approved fit to a model version; resolves the version in force for a segment and date (D-F2). </w:t>
+            </w:r>
+            <w:r>
+              <w:rPr>
+                <w:b/>
+                <w:i w:val="0"/>
+                <w:sz w:val="17"/>
+              </w:rPr>
+              <w:t>Status 14 October 2026:</w:t>
+            </w:r>
+            <w:r>
+              <w:rPr>
+                <w:b w:val="0"/>
+                <w:i w:val="0"/>
+                <w:sz w:val="17"/>
+              </w:rPr>
+              <w:t xml:space="preserve"> built for the book as a whole; no segment</w:t>
             </w:r>
           </w:p>
         </w:tc>
@@ -5670,7 +7066,23 @@
                 <w:i w:val="0"/>
                 <w:sz w:val="17"/>
               </w:rPr>
-              <w:t>Per scenario: the PD term structure, and the LGD where in scope (D-F4, D-F8)</w:t>
+              <w:t xml:space="preserve">Per scenario: the PD term structure, and the LGD where in scope (D-F4, D-F8). </w:t>
+            </w:r>
+            <w:r>
+              <w:rPr>
+                <w:b/>
+                <w:i w:val="0"/>
+                <w:sz w:val="17"/>
+              </w:rPr>
+              <w:t>Status 14 October 2026:</w:t>
+            </w:r>
+            <w:r>
+              <w:rPr>
+                <w:b w:val="0"/>
+                <w:i w:val="0"/>
+                <w:sz w:val="17"/>
+              </w:rPr>
+              <w:t xml:space="preserve"> built for the PD per portfolio, as evidence; no LGD</w:t>
             </w:r>
           </w:p>
         </w:tc>
@@ -5777,7 +7189,23 @@
                 <w:i w:val="0"/>
                 <w:sz w:val="17"/>
               </w:rPr>
-              <w:t>The EIR basis, including the floating-rate current EIR (D-F6)</w:t>
+              <w:t xml:space="preserve">The EIR basis, including the floating-rate current EIR (D-F6). </w:t>
+            </w:r>
+            <w:r>
+              <w:rPr>
+                <w:b/>
+                <w:i w:val="0"/>
+                <w:sz w:val="17"/>
+              </w:rPr>
+              <w:t>Status 14 October 2026:</w:t>
+            </w:r>
+            <w:r>
+              <w:rPr>
+                <w:b w:val="0"/>
+                <w:i w:val="0"/>
+                <w:sz w:val="17"/>
+              </w:rPr>
+              <w:t xml:space="preserve"> the floating-rate current EIR is not built (the original EIR, labelled EIR_ORIGINAL_FLOATING_PROXY); the month-end discounted allowance comes from TimePhasedEclService, EclDiscountingService being the single-horizon proxy used when the time-phased engine cannot run</w:t>
             </w:r>
           </w:p>
         </w:tc>
@@ -5822,7 +7250,40 @@
                 <w:i w:val="0"/>
                 <w:sz w:val="17"/>
               </w:rPr>
-              <w:t>The per-scenario, per-year ECL, then the weighting (D-F3)</w:t>
+              <w:t xml:space="preserve">The per-scenario, per-year ECL, then the weighting (D-F3). </w:t>
+            </w:r>
+            <w:r>
+              <w:rPr>
+                <w:b/>
+                <w:i w:val="0"/>
+                <w:sz w:val="17"/>
+              </w:rPr>
+              <w:t>Status 14 October 2026:</w:t>
+            </w:r>
+            <w:r>
+              <w:rPr>
+                <w:b w:val="0"/>
+                <w:i w:val="0"/>
+                <w:sz w:val="17"/>
+              </w:rPr>
+              <w:t xml:space="preserve"> the per-scenario rows and the weighted-against-booked check of the month record are FliCloseService (undiscounted). TimePhasedEclService computes the discounted allowance per scenario, month by month, and weights it inside each loan; since commit 216aee2 it runs on every month-end and leaves </w:t>
+            </w:r>
+            <w:r>
+              <w:rPr>
+                <w:rFonts w:ascii="Consolas" w:hAnsi="Consolas"/>
+                <w:b w:val="0"/>
+                <w:i w:val="0"/>
+                <w:sz w:val="17"/>
+              </w:rPr>
+              <w:t>ecl_value</w:t>
+            </w:r>
+            <w:r>
+              <w:rPr>
+                <w:b w:val="0"/>
+                <w:i w:val="0"/>
+                <w:sz w:val="17"/>
+              </w:rPr>
+              <w:t xml:space="preserve"> alone</w:t>
             </w:r>
           </w:p>
         </w:tc>
@@ -5875,7 +7336,32 @@
                 <w:i w:val="0"/>
                 <w:sz w:val="17"/>
               </w:rPr>
-              <w:t>The build-up and the movement reconciliation with an FLI line</w:t>
+              <w:t xml:space="preserve">The build-up and the movement reconciliation with an FLI line. </w:t>
+            </w:r>
+            <w:r>
+              <w:rPr>
+                <w:b/>
+                <w:i w:val="0"/>
+                <w:sz w:val="17"/>
+              </w:rPr>
+              <w:t>Status 14 October 2026:</w:t>
+            </w:r>
+            <w:r>
+              <w:rPr>
+                <w:b w:val="0"/>
+                <w:i w:val="0"/>
+                <w:sz w:val="17"/>
+              </w:rPr>
+              <w:t xml:space="preserve"> the build-up has the FLI lines (ECL before FLI, model effect, overlays; EclBuildUpService, read by FliCloseService.php:47-49). The IFRS 9 note's movement reconciliation has no FLI line (it only counts the loans with an FLI-adjusted PD, Ifrs9NoteService.php:222-238, 491), and both read the undiscounted </w:t>
+            </w:r>
+            <w:r>
+              <w:rPr>
+                <w:rFonts w:ascii="Consolas" w:hAnsi="Consolas"/>
+                <w:b w:val="0"/>
+                <w:i w:val="0"/>
+                <w:sz w:val="17"/>
+              </w:rPr>
+              <w:t>ecl_value</w:t>
             </w:r>
           </w:p>
         </w:tc>
@@ -6486,6 +7972,25 @@
     </w:p>
     <w:p>
       <w:pPr>
+        <w:spacing w:after="120"/>
+      </w:pPr>
+      <w:r>
+        <w:rPr>
+          <w:b/>
+          <w:i w:val="0"/>
+        </w:rPr>
+        <w:t>Status 14 October 2026:</w:t>
+      </w:r>
+      <w:r>
+        <w:rPr>
+          <w:b w:val="0"/>
+          <w:i w:val="0"/>
+        </w:rPr>
+        <w:t xml:space="preserve"> also still to build: the FLI scenario workbook and the FLI impact workbook (the two reports above are single branded exports, not the workbooks of this section). The two reports show the undiscounted engine measure as "booked", while the month-end now books the discounted allowance.</w:t>
+      </w:r>
+    </w:p>
+    <w:p>
+      <w:pPr>
         <w:pStyle w:val="Heading2"/>
       </w:pPr>
       <w:r>
@@ -7548,7 +9053,42 @@
           <w:b w:val="0"/>
           <w:i w:val="0"/>
         </w:rPr>
-        <w:t>For August 2026 on the demonstration database: ECL before FLI MWK 11.76 billion, forward-looking effect MWK (0.44) billion, manual overlays nil, ECL booked MWK 11.31 billion. The approved fit is the prime lending rate to the Stage 3 share at a nine-month lag (R-squared 0.74 on 26 monthly points), under the first scenario set. Every approval on that database is labelled "Demo, not a MAIIC approval". The fall in the ECL from the forward-looking effect follows the PLR's decline from a peak of 25.4 percent to 20.8 percent in August 2026; with 26 points and one driver, it is model output to be challenged, not yet a conclusion, which is the case for phases 1 and 5.</w:t>
+        <w:t>For August 2026 on the demonstration database: ECL before FLI MWK 11.76 billion, forward-looking effect MWK (0.44) billion, manual overlays nil, ECL booked MWK 11.31 billion. The approved fit is the prime lending rate to the Stage 3 share at a nine-month lag (R-squared 0.74 on 26 monthly points), under the first scenario set. Every approval on that database is labelled as not a MAIIC approval: "Demo, not a MAIIC approval" on the fits and model versions, "System Bootstrap (automated data-readiness, not a MAIIC approval)" on the scenario sets (corrected 14 October 2026; it said every approval is labelled "Demo, not a MAIIC approval"). The fall in the ECL from the forward-looking effect follows the PLR's decline from a peak of 25.4 percent to 20.8 percent in August 2026; with 26 points and one driver, it is model output to be challenged, not yet a conclusion, which is the case for phases 1 and 5.</w:t>
+      </w:r>
+    </w:p>
+    <w:p>
+      <w:pPr>
+        <w:spacing w:after="120"/>
+      </w:pPr>
+      <w:r>
+        <w:rPr>
+          <w:b/>
+          <w:i w:val="0"/>
+        </w:rPr>
+        <w:t>Status 14 October 2026:</w:t>
+      </w:r>
+      <w:r>
+        <w:rPr>
+          <w:b w:val="0"/>
+          <w:i w:val="0"/>
+        </w:rPr>
+        <w:t xml:space="preserve"> the figures tie to database maiic_ifrs9_demo (the application's database): month record </w:t>
+      </w:r>
+      <w:r>
+        <w:rPr>
+          <w:rFonts w:ascii="Consolas" w:hAnsi="Consolas"/>
+          <w:b w:val="0"/>
+          <w:i w:val="0"/>
+          <w:sz w:val="18"/>
+        </w:rPr>
+        <w:t>fli_run_snapshots</w:t>
+      </w:r>
+      <w:r>
+        <w:rPr>
+          <w:b w:val="0"/>
+          <w:i w:val="0"/>
+        </w:rPr>
+        <w:t xml:space="preserve"> id 3 of 13 October, 11:59 (ECL before FLI 11,755,464,420.89, model effect (440,884,613.92), overlays nil, booked 11,314,579,806.97; model version 8, PLR to STAGE3_SHARE, lag 9, R-squared 0.738 on 26 points; PLR peak 25.4 percent in September 2024, 20.8 percent in August 2026). They are on the undiscounted measure: August 2026 on that database has no discounted value, and the record was made before commit 216aee2 made the month-end discounted. The fresh bootstrap database maiic_ifrs9_results2 (13 October, 23:23, also before 216aee2) is not comparable: it has no model version and no month record, and its months ran with the PD held.</w:t>
       </w:r>
     </w:p>
     <w:p>
@@ -7742,7 +9282,23 @@
                 <w:i w:val="0"/>
                 <w:sz w:val="17"/>
               </w:rPr>
-              <w:t>The eight approved fits of January to August 2026 became versions 1 to 8; a version governs later months without a new fit (test)</w:t>
+              <w:t xml:space="preserve">The eight approved fits of January to August 2026 became versions 1 to 8; a version governs later months without a new fit (test). </w:t>
+            </w:r>
+            <w:r>
+              <w:rPr>
+                <w:b/>
+                <w:i w:val="0"/>
+                <w:sz w:val="17"/>
+              </w:rPr>
+              <w:t>Status 14 October 2026:</w:t>
+            </w:r>
+            <w:r>
+              <w:rPr>
+                <w:b w:val="0"/>
+                <w:i w:val="0"/>
+                <w:sz w:val="17"/>
+              </w:rPr>
+              <w:t xml:space="preserve"> the lifecycle built is PROPOSED, PUBLISHED, SUPERSEDED, REJECTED, RETIRED (no Calibrated or Validated); the route can still let the PD hold outside the month-end job (D-F1 note)</w:t>
             </w:r>
           </w:p>
         </w:tc>
@@ -7825,7 +9381,23 @@
                 <w:i w:val="0"/>
                 <w:sz w:val="17"/>
               </w:rPr>
-              <w:t>August 2026: weighted ECL 11,314,579,806.37 against booked 11,314,579,806.97</w:t>
+              <w:t xml:space="preserve">August 2026: weighted ECL 11,314,579,806.37 against booked 11,314,579,806.97. </w:t>
+            </w:r>
+            <w:r>
+              <w:rPr>
+                <w:b/>
+                <w:i w:val="0"/>
+                <w:sz w:val="17"/>
+              </w:rPr>
+              <w:t>Status 14 October 2026:</w:t>
+            </w:r>
+            <w:r>
+              <w:rPr>
+                <w:b w:val="0"/>
+                <w:i w:val="0"/>
+                <w:sz w:val="17"/>
+              </w:rPr>
+              <w:t xml:space="preserve"> on the undiscounted measure; no automated test of FliCloseService</w:t>
             </w:r>
           </w:p>
         </w:tc>
@@ -7933,7 +9505,23 @@
                 <w:i w:val="0"/>
                 <w:sz w:val="17"/>
               </w:rPr>
-              <w:t>Six portfolios, four scenarios, five to seven years</w:t>
+              <w:t xml:space="preserve">Six portfolios, four scenarios, five to seven years. </w:t>
+            </w:r>
+            <w:r>
+              <w:rPr>
+                <w:b/>
+                <w:i w:val="0"/>
+                <w:sz w:val="17"/>
+              </w:rPr>
+              <w:t>Status 14 October 2026:</w:t>
+            </w:r>
+            <w:r>
+              <w:rPr>
+                <w:b w:val="0"/>
+                <w:i w:val="0"/>
+                <w:sz w:val="17"/>
+              </w:rPr>
+              <w:t xml:space="preserve"> evidence only; the booked Stage 2 ECL does not use it; no automated test of FliProjectionService</w:t>
             </w:r>
           </w:p>
         </w:tc>
@@ -7998,7 +9586,23 @@
                 <w:i w:val="0"/>
                 <w:sz w:val="17"/>
               </w:rPr>
-              <w:t>Tested with an entered series</w:t>
+              <w:t xml:space="preserve">Tested with an entered series. </w:t>
+            </w:r>
+            <w:r>
+              <w:rPr>
+                <w:b/>
+                <w:i w:val="0"/>
+                <w:sz w:val="17"/>
+              </w:rPr>
+              <w:t>Status 14 October 2026:</w:t>
+            </w:r>
+            <w:r>
+              <w:rPr>
+                <w:b w:val="0"/>
+                <w:i w:val="0"/>
+                <w:sz w:val="17"/>
+              </w:rPr>
+              <w:t xml:space="preserve"> there is no automated test of the EXT_ route and no external series is held in either database; the stationarity check is not a gate</w:t>
             </w:r>
           </w:p>
         </w:tc>
@@ -8146,7 +9750,23 @@
                 <w:i w:val="0"/>
                 <w:sz w:val="17"/>
               </w:rPr>
-              <w:t>Existing as-at tests pass</w:t>
+              <w:t xml:space="preserve">Existing as-at tests pass. </w:t>
+            </w:r>
+            <w:r>
+              <w:rPr>
+                <w:b/>
+                <w:i w:val="0"/>
+                <w:sz w:val="17"/>
+              </w:rPr>
+              <w:t>Status 14 October 2026:</w:t>
+            </w:r>
+            <w:r>
+              <w:rPr>
+                <w:b w:val="0"/>
+                <w:i w:val="0"/>
+                <w:sz w:val="17"/>
+              </w:rPr>
+              <w:t xml:space="preserve"> revisions still replace the earlier value (MacroImportService.php:82-84); 0 of 261 observations have a release date</w:t>
             </w:r>
           </w:p>
         </w:tc>
@@ -8220,7 +9840,7 @@
                 <w:i w:val="0"/>
                 <w:sz w:val="17"/>
               </w:rPr>
-              <w:t>Each month recorded with its inputs and sign-off</w:t>
+              <w:t>August 2026 recorded on maiic_ifrs9_demo (record id 3), not signed off; no staging run, EIR lock or discount basis in the record (corrected 14 October 2026; it said "Each month recorded with its inputs and sign-off")</w:t>
             </w:r>
           </w:p>
         </w:tc>
@@ -8285,7 +9905,23 @@
                 <w:i w:val="0"/>
                 <w:sz w:val="17"/>
               </w:rPr>
-              <w:t>The navigation test; a month started and finished from the screens on the demonstration database</w:t>
+              <w:t xml:space="preserve">The navigation test; a month started and finished from the screens on the demonstration database. </w:t>
+            </w:r>
+            <w:r>
+              <w:rPr>
+                <w:b/>
+                <w:i w:val="0"/>
+                <w:sz w:val="17"/>
+              </w:rPr>
+              <w:t>Status 14 October 2026:</w:t>
+            </w:r>
+            <w:r>
+              <w:rPr>
+                <w:b w:val="0"/>
+                <w:i w:val="0"/>
+                <w:sz w:val="17"/>
+              </w:rPr>
+              <w:t xml:space="preserve"> no month is signed off on either database, so no month has been finished</w:t>
             </w:r>
           </w:p>
         </w:tc>
@@ -8350,7 +9986,7 @@
                 <w:i w:val="0"/>
                 <w:sz w:val="17"/>
               </w:rPr>
-              <w:t>Clicked through on the demonstration database; tests</w:t>
+              <w:t>Clicked through on the demonstration database; page-open test (AuditFindingM16ScreensTest) and the macro file check (ImportValidationTest), no test of create, edit or delete (corrected 14 October 2026; it said "tests")</w:t>
             </w:r>
           </w:p>
         </w:tc>
@@ -8506,7 +10142,49 @@
                 <w:i w:val="0"/>
                 <w:sz w:val="17"/>
               </w:rPr>
-              <w:t>Run end to end from the console</w:t>
+              <w:t xml:space="preserve">Run end to end from the console. </w:t>
+            </w:r>
+            <w:r>
+              <w:rPr>
+                <w:b/>
+                <w:i w:val="0"/>
+                <w:sz w:val="17"/>
+              </w:rPr>
+              <w:t>Status 14 October 2026:</w:t>
+            </w:r>
+            <w:r>
+              <w:rPr>
+                <w:b w:val="0"/>
+                <w:i w:val="0"/>
+                <w:sz w:val="17"/>
+              </w:rPr>
+              <w:t xml:space="preserve"> the job now also segments the programme portfolios and runs the ECL discounted (216aee2); no automated test of </w:t>
+            </w:r>
+            <w:r>
+              <w:rPr>
+                <w:rFonts w:ascii="Consolas" w:hAnsi="Consolas"/>
+                <w:b w:val="0"/>
+                <w:i w:val="0"/>
+                <w:sz w:val="17"/>
+              </w:rPr>
+              <w:t>maiic:task</w:t>
+            </w:r>
+            <w:r>
+              <w:rPr>
+                <w:b w:val="0"/>
+                <w:i w:val="0"/>
+                <w:sz w:val="17"/>
+              </w:rPr>
+              <w:t xml:space="preserve"> or </w:t>
+            </w:r>
+            <w:r>
+              <w:rPr>
+                <w:rFonts w:ascii="Consolas" w:hAnsi="Consolas"/>
+                <w:b w:val="0"/>
+                <w:i w:val="0"/>
+                <w:sz w:val="17"/>
+              </w:rPr>
+              <w:t>fli:month-end</w:t>
             </w:r>
           </w:p>
         </w:tc>
@@ -8606,7 +10284,40 @@
                 <w:i w:val="0"/>
                 <w:sz w:val="17"/>
               </w:rPr>
-              <w:t>A full month-end from the console reproduced the booked August ECL</w:t>
+              <w:t xml:space="preserve">A full month-end from the console reproduced the booked August ECL. </w:t>
+            </w:r>
+            <w:r>
+              <w:rPr>
+                <w:b/>
+                <w:i w:val="0"/>
+                <w:sz w:val="17"/>
+              </w:rPr>
+              <w:t>Status 14 October 2026:</w:t>
+            </w:r>
+            <w:r>
+              <w:rPr>
+                <w:b w:val="0"/>
+                <w:i w:val="0"/>
+                <w:sz w:val="17"/>
+              </w:rPr>
+              <w:t xml:space="preserve"> the checklist step and the month-end job's stop are built; </w:t>
+            </w:r>
+            <w:r>
+              <w:rPr>
+                <w:rFonts w:ascii="Consolas" w:hAnsi="Consolas"/>
+                <w:b w:val="0"/>
+                <w:i w:val="0"/>
+                <w:sz w:val="17"/>
+              </w:rPr>
+              <w:t>ifrs9:segment-ecl</w:t>
+            </w:r>
+            <w:r>
+              <w:rPr>
+                <w:b w:val="0"/>
+                <w:i w:val="0"/>
+                <w:sz w:val="17"/>
+              </w:rPr>
+              <w:t xml:space="preserve"> and the ECL screen do not refuse a run without the FLI step</w:t>
             </w:r>
           </w:p>
         </w:tc>
@@ -8623,6 +10334,73 @@
           <w:i w:val="0"/>
         </w:rPr>
         <w:t>Not built yet: the scenario-sensitive LGD (D-F8, awaiting question 4 of section 10), the current-EIR discounting of floating-rate loans (D-F6, awaiting question 5), the credit-cycle method on an industry series (D-F7, awaiting question 2) and the calibration and scenario workbooks (section 8).</w:t>
+      </w:r>
+    </w:p>
+    <w:p>
+      <w:pPr>
+        <w:spacing w:after="120"/>
+      </w:pPr>
+      <w:r>
+        <w:rPr>
+          <w:b/>
+          <w:i w:val="0"/>
+        </w:rPr>
+        <w:t>Status 14 October 2026:</w:t>
+      </w:r>
+      <w:r>
+        <w:rPr>
+          <w:b w:val="0"/>
+          <w:i w:val="0"/>
+        </w:rPr>
+        <w:t xml:space="preserve"> also not built: the refusal of an ECL run without the FLI step (D-F12), the stationarity gate (D-F7), segment assignment (</w:t>
+      </w:r>
+      <w:r>
+        <w:rPr>
+          <w:rFonts w:ascii="Consolas" w:hAnsi="Consolas"/>
+          <w:b w:val="0"/>
+          <w:i w:val="0"/>
+          <w:sz w:val="18"/>
+        </w:rPr>
+        <w:t>fli_model_assignments</w:t>
+      </w:r>
+      <w:r>
+        <w:rPr>
+          <w:b w:val="0"/>
+          <w:i w:val="0"/>
+        </w:rPr>
+        <w:t xml:space="preserve">), the keeping of revised vintages (D-F10), the staging run, EIR lock and discount basis in the month record (D-F11), the report of capped scenario PDs, the refusal of mixed monthly and annual units in a series (section 7), the FLI impact workbook and the FLI line in the IFRS 9 note (section 8), the Calibrated and Validated lifecycle states (D-F2), and a month record and FLI reports on the discounted allowance. FliCloseService, FliProjectionService, FliMonthEnd, </w:t>
+      </w:r>
+      <w:r>
+        <w:rPr>
+          <w:rFonts w:ascii="Consolas" w:hAnsi="Consolas"/>
+          <w:b w:val="0"/>
+          <w:i w:val="0"/>
+          <w:sz w:val="18"/>
+        </w:rPr>
+        <w:t>fli:month-end</w:t>
+      </w:r>
+      <w:r>
+        <w:rPr>
+          <w:b w:val="0"/>
+          <w:i w:val="0"/>
+        </w:rPr>
+        <w:t xml:space="preserve"> and </w:t>
+      </w:r>
+      <w:r>
+        <w:rPr>
+          <w:rFonts w:ascii="Consolas" w:hAnsi="Consolas"/>
+          <w:b w:val="0"/>
+          <w:i w:val="0"/>
+          <w:sz w:val="18"/>
+        </w:rPr>
+        <w:t>maiic:task</w:t>
+      </w:r>
+      <w:r>
+        <w:rPr>
+          <w:b w:val="0"/>
+          <w:i w:val="0"/>
+        </w:rPr>
+        <w:t xml:space="preserve"> have no automated tests.</w:t>
       </w:r>
     </w:p>
     <w:sectPr>

</xml_diff>

<commit_message>
Documentation brought up to the current system: both manuals rewritten, 174 screenshots retaken, Technical Manual and Installation Guide corrected
- User Manual 116 articles (from 80), Administrator Manual 37 (from 28): every menu page and tab has an
  article with its purpose, cards and columns, every button and icon with who may press it, filters,
  empty states, exports and tasks; the sidebar, breadcrumbs, actions row, import templates, dashboard
  charts, registers, Governance Centre, booked ECL, IFRS 9 note (a)-(h) and RBM return covered
- 119 screenshots replaced and 55 new (light mode, current UI)
- Technical Manual (14 chapters) and Installation Guide (12) checked against the code: data model,
  onboarding and landing zone, engines, EIR, reports, security, commands and the bootstrap, config,
  tests, deploy; FLI spec status notes for D-F3, D-F11 and note sections (f)-(h)

Co-Authored-By: Claude Opus 5.5 <noreply@anthropic.com>
</commit_message>
<xml_diff>
--- a/docs/MAIIC_FLI_Module_Specification_v1_2026-10-13.docx
+++ b/docs/MAIIC_FLI_Module_Specification_v1_2026-10-13.docx
@@ -62,7 +62,7 @@
           <w:color w:val="5B6470"/>
           <w:sz w:val="18"/>
         </w:rPr>
-        <w:t>Draft for review, status-checked against the code on 14 October 2026 (abe140d plus the uncommitted working tree; dated 'Status 14 October 2026' notes, nothing earlier deleted). Earlier status: Draft for review, updated 13 October 2026 evening (decisions D-F13 to D-F16: the earlier screens kept and improved, the macro statistics screens, the reports that read the month record, the month-end job). Builds on specification version 4, sections 13 (macro statistics), 14 (forward-looking adjustments) and 15 (economic scenarios), which stay in force; where this document decides something new, it says so and it governs for the forward-looking module.</w:t>
+        <w:t>Draft for review, status-checked against the code on 14 October 2026 (abe140d plus the uncommitted working tree; dated 'Status 14 October 2026' notes, nothing earlier deleted), with later notes of the same day after the go-live build (467ef7f) on D-F3, D-F11 and the IFRS 9 note (section 8). Earlier status: Draft for review, updated 13 October 2026 evening (decisions D-F13 to D-F16: the earlier screens kept and improved, the macro statistics screens, the reports that read the month record, the month-end job). Builds on specification version 4, sections 13 (macro statistics), 14 (forward-looking adjustments) and 15 (economic scenarios), which stay in force; where this document decides something new, it says so and it governs for the forward-looking module.</w:t>
       </w:r>
     </w:p>
     <w:p>
@@ -3101,6 +3101,233 @@
     </w:p>
     <w:p>
       <w:pPr>
+        <w:spacing w:after="120"/>
+      </w:pPr>
+      <w:r>
+        <w:rPr>
+          <w:b/>
+          <w:i w:val="0"/>
+        </w:rPr>
+        <w:t>Status 14 October 2026, after the go-live build (commit 6b57002, branch head 467ef7f):</w:t>
+      </w:r>
+      <w:r>
+        <w:rPr>
+          <w:b w:val="0"/>
+          <w:i w:val="0"/>
+        </w:rPr>
+        <w:t xml:space="preserve"> the month record now carries the discounted allowance beside the undiscounted engine build-up. TimePhasedEclService keeps each loan's time-phased shortfall per scenario, undiscounted and discounted, with the weight it used (</w:t>
+      </w:r>
+      <w:r>
+        <w:rPr>
+          <w:rFonts w:ascii="Consolas" w:hAnsi="Consolas"/>
+          <w:b w:val="0"/>
+          <w:i w:val="0"/>
+          <w:sz w:val="18"/>
+        </w:rPr>
+        <w:t>loan_books.ecl_by_scenario</w:t>
+      </w:r>
+      <w:r>
+        <w:rPr>
+          <w:b w:val="0"/>
+          <w:i w:val="0"/>
+        </w:rPr>
+        <w:t xml:space="preserve">, migration 2026_10_14_210000), and FliCloseService::record writes the discounted ECL of each loan under each scenario into </w:t>
+      </w:r>
+      <w:r>
+        <w:rPr>
+          <w:rFonts w:ascii="Consolas" w:hAnsi="Consolas"/>
+          <w:b w:val="0"/>
+          <w:i w:val="0"/>
+          <w:sz w:val="18"/>
+        </w:rPr>
+        <w:t>ecl_scenario_results.ecl_discounted</w:t>
+      </w:r>
+      <w:r>
+        <w:rPr>
+          <w:b w:val="0"/>
+          <w:i w:val="0"/>
+        </w:rPr>
+        <w:t xml:space="preserve"> beside the engine measure. The record then weights the discounted figures over the same scenario weights and reconciles them to the discounted allowance booked (</w:t>
+      </w:r>
+      <w:r>
+        <w:rPr>
+          <w:rFonts w:ascii="Consolas" w:hAnsi="Consolas"/>
+          <w:b w:val="0"/>
+          <w:i w:val="0"/>
+          <w:sz w:val="18"/>
+        </w:rPr>
+        <w:t>booked_ecl_discounted</w:t>
+      </w:r>
+      <w:r>
+        <w:rPr>
+          <w:b w:val="0"/>
+          <w:i w:val="0"/>
+        </w:rPr>
+        <w:t xml:space="preserve">, </w:t>
+      </w:r>
+      <w:r>
+        <w:rPr>
+          <w:rFonts w:ascii="Consolas" w:hAnsi="Consolas"/>
+          <w:b w:val="0"/>
+          <w:i w:val="0"/>
+          <w:sz w:val="18"/>
+        </w:rPr>
+        <w:t>weighted_ecl_discounted</w:t>
+      </w:r>
+      <w:r>
+        <w:rPr>
+          <w:b w:val="0"/>
+          <w:i w:val="0"/>
+        </w:rPr>
+        <w:t xml:space="preserve">, </w:t>
+      </w:r>
+      <w:r>
+        <w:rPr>
+          <w:rFonts w:ascii="Consolas" w:hAnsi="Consolas"/>
+          <w:b w:val="0"/>
+          <w:i w:val="0"/>
+          <w:sz w:val="18"/>
+        </w:rPr>
+        <w:t>discounted_difference</w:t>
+      </w:r>
+      <w:r>
+        <w:rPr>
+          <w:b w:val="0"/>
+          <w:i w:val="0"/>
+        </w:rPr>
+        <w:t xml:space="preserve">, </w:t>
+      </w:r>
+      <w:r>
+        <w:rPr>
+          <w:rFonts w:ascii="Consolas" w:hAnsi="Consolas"/>
+          <w:b w:val="0"/>
+          <w:i w:val="0"/>
+          <w:sz w:val="18"/>
+        </w:rPr>
+        <w:t>discounted_reconciles</w:t>
+      </w:r>
+      <w:r>
+        <w:rPr>
+          <w:b w:val="0"/>
+          <w:i w:val="0"/>
+        </w:rPr>
+        <w:t>, to half a cent a loan), with the reconciliation from the engine measure (the projection effect and the discounting effect) and the loans that could not be discounted named with the reason (</w:t>
+      </w:r>
+      <w:r>
+        <w:rPr>
+          <w:rFonts w:ascii="Consolas" w:hAnsi="Consolas"/>
+          <w:b w:val="0"/>
+          <w:i w:val="0"/>
+          <w:sz w:val="18"/>
+        </w:rPr>
+        <w:t>discount_unresolved_loans</w:t>
+      </w:r>
+      <w:r>
+        <w:rPr>
+          <w:b w:val="0"/>
+          <w:i w:val="0"/>
+        </w:rPr>
+        <w:t xml:space="preserve">, </w:t>
+      </w:r>
+      <w:r>
+        <w:rPr>
+          <w:rFonts w:ascii="Consolas" w:hAnsi="Consolas"/>
+          <w:b w:val="0"/>
+          <w:i w:val="0"/>
+          <w:sz w:val="18"/>
+        </w:rPr>
+        <w:t>unresolved_ecl</w:t>
+      </w:r>
+      <w:r>
+        <w:rPr>
+          <w:b w:val="0"/>
+          <w:i w:val="0"/>
+        </w:rPr>
+        <w:t xml:space="preserve">, </w:t>
+      </w:r>
+      <w:r>
+        <w:rPr>
+          <w:rFonts w:ascii="Consolas" w:hAnsi="Consolas"/>
+          <w:b w:val="0"/>
+          <w:i w:val="0"/>
+          <w:sz w:val="18"/>
+        </w:rPr>
+        <w:t>discount_detail</w:t>
+      </w:r>
+      <w:r>
+        <w:rPr>
+          <w:b w:val="0"/>
+          <w:i w:val="0"/>
+        </w:rPr>
+        <w:t>). The Mega Farm programme is measured by its own engine (D30) and shown as its own line on the record (</w:t>
+      </w:r>
+      <w:r>
+        <w:rPr>
+          <w:rFonts w:ascii="Consolas" w:hAnsi="Consolas"/>
+          <w:b w:val="0"/>
+          <w:i w:val="0"/>
+          <w:sz w:val="18"/>
+        </w:rPr>
+        <w:t>programme_loans</w:t>
+      </w:r>
+      <w:r>
+        <w:rPr>
+          <w:b w:val="0"/>
+          <w:i w:val="0"/>
+        </w:rPr>
+        <w:t xml:space="preserve">, </w:t>
+      </w:r>
+      <w:r>
+        <w:rPr>
+          <w:rFonts w:ascii="Consolas" w:hAnsi="Consolas"/>
+          <w:b w:val="0"/>
+          <w:i w:val="0"/>
+          <w:sz w:val="18"/>
+        </w:rPr>
+        <w:t>programme_ecl</w:t>
+      </w:r>
+      <w:r>
+        <w:rPr>
+          <w:b w:val="0"/>
+          <w:i w:val="0"/>
+        </w:rPr>
+        <w:t xml:space="preserve">), outside the record's figures; a month whose every loan is in the programme is refused. Sign-off (FliCloseService::signOff) refuses the person who recorded the month (maker-checker), a record whose discounted figures do not reconcile, and a month with loans left undiscounted unless a commentary says why. Tested in FliCloseDiscountedRecordTest (three tests: a discounted month with a Mega Farm programme recorded and reconciled; a second person signing off with a commentary on the undiscounted loans; a discounted allowance that does not weight back refused). The undiscounted </w:t>
+      </w:r>
+      <w:r>
+        <w:rPr>
+          <w:rFonts w:ascii="Consolas" w:hAnsi="Consolas"/>
+          <w:b w:val="0"/>
+          <w:i w:val="0"/>
+          <w:sz w:val="18"/>
+        </w:rPr>
+        <w:t>ecl_value</w:t>
+      </w:r>
+      <w:r>
+        <w:rPr>
+          <w:b w:val="0"/>
+          <w:i w:val="0"/>
+        </w:rPr>
+        <w:t xml:space="preserve"> and its weighted check stay on the record as the engine build-up. No month is yet recorded on the new code: maiic_ifrs9_demo and maiic_ifrs9_results2 predate the migration (their </w:t>
+      </w:r>
+      <w:r>
+        <w:rPr>
+          <w:rFonts w:ascii="Consolas" w:hAnsi="Consolas"/>
+          <w:b w:val="0"/>
+          <w:i w:val="0"/>
+          <w:sz w:val="18"/>
+        </w:rPr>
+        <w:t>fli_run_snapshots</w:t>
+      </w:r>
+      <w:r>
+        <w:rPr>
+          <w:b w:val="0"/>
+          <w:i w:val="0"/>
+        </w:rPr>
+        <w:t xml:space="preserve"> has no discounted columns), and the fresh bootstrap database maiic_ifrs9_final_a, still building when this note was written, held no month record.</w:t>
+      </w:r>
+    </w:p>
+    <w:p>
+      <w:pPr>
         <w:pStyle w:val="Heading3"/>
       </w:pPr>
       <w:r>
@@ -3834,6 +4061,73 @@
           <w:i w:val="0"/>
         </w:rPr>
         <w:t>. Because revisions overwrite (D-F10), the vintage it names cannot be re-read. maiic_ifrs9_demo holds one current record (August 2026, RECORDED, not signed off); maiic_ifrs9_results2 holds none.</w:t>
+      </w:r>
+    </w:p>
+    <w:p>
+      <w:pPr>
+        <w:spacing w:after="120"/>
+      </w:pPr>
+      <w:r>
+        <w:rPr>
+          <w:b/>
+          <w:i w:val="0"/>
+        </w:rPr>
+        <w:t>Status 14 October 2026, after the go-live build (commit 6b57002, branch head 467ef7f):</w:t>
+      </w:r>
+      <w:r>
+        <w:rPr>
+          <w:b w:val="0"/>
+          <w:i w:val="0"/>
+        </w:rPr>
+        <w:t xml:space="preserve"> the record now names its discounting basis (</w:t>
+      </w:r>
+      <w:r>
+        <w:rPr>
+          <w:rFonts w:ascii="Consolas" w:hAnsi="Consolas"/>
+          <w:b w:val="0"/>
+          <w:i w:val="0"/>
+          <w:sz w:val="18"/>
+        </w:rPr>
+        <w:t>inputs.discount_basis</w:t>
+      </w:r>
+      <w:r>
+        <w:rPr>
+          <w:b w:val="0"/>
+          <w:i w:val="0"/>
+        </w:rPr>
+        <w:t>: TimePhasedEclService at the locked original EIR, a floating-rate loan at its current EIR at the month-end, unresolved loans named) and carries the discounted allowance beside the undiscounted engine build-up: the discounted figure booked and weighted per scenario, the difference and whether it reconciles, the projection and discounting effects, and the loans left undiscounted with the reason (see D-F3). The Mega Farm programme is its own line (</w:t>
+      </w:r>
+      <w:r>
+        <w:rPr>
+          <w:rFonts w:ascii="Consolas" w:hAnsi="Consolas"/>
+          <w:b w:val="0"/>
+          <w:i w:val="0"/>
+          <w:sz w:val="18"/>
+        </w:rPr>
+        <w:t>programme_loans</w:t>
+      </w:r>
+      <w:r>
+        <w:rPr>
+          <w:b w:val="0"/>
+          <w:i w:val="0"/>
+        </w:rPr>
+        <w:t xml:space="preserve">, </w:t>
+      </w:r>
+      <w:r>
+        <w:rPr>
+          <w:rFonts w:ascii="Consolas" w:hAnsi="Consolas"/>
+          <w:b w:val="0"/>
+          <w:i w:val="0"/>
+          <w:sz w:val="18"/>
+        </w:rPr>
+        <w:t>programme_ecl</w:t>
+      </w:r>
+      <w:r>
+        <w:rPr>
+          <w:b w:val="0"/>
+          <w:i w:val="0"/>
+        </w:rPr>
+        <w:t>), outside the record's figures. Sign-off refuses the person who recorded the month, an unreconciled discounted figure, and undiscounted loans without a commentary. The record still does not name the staging run or the EIR lock as such, and the macro vintage it names still cannot be re-read while revisions overwrite (D-F10).</w:t>
       </w:r>
     </w:p>
     <w:p>
@@ -7987,6 +8281,41 @@
           <w:i w:val="0"/>
         </w:rPr>
         <w:t xml:space="preserve"> also still to build: the FLI scenario workbook and the FLI impact workbook (the two reports above are single branded exports, not the workbooks of this section). The two reports show the undiscounted engine measure as "booked", while the month-end now books the discounted allowance.</w:t>
+      </w:r>
+    </w:p>
+    <w:p>
+      <w:pPr>
+        <w:spacing w:after="120"/>
+      </w:pPr>
+      <w:r>
+        <w:rPr>
+          <w:b/>
+          <w:i w:val="0"/>
+        </w:rPr>
+        <w:t>Status 14 October 2026, after the go-live build (commit 6b57002, branch head 467ef7f), the IFRS 9 note:</w:t>
+      </w:r>
+      <w:r>
+        <w:rPr>
+          <w:b w:val="0"/>
+          <w:i w:val="0"/>
+        </w:rPr>
+        <w:t xml:space="preserve"> Ifrs9NoteService now reads the booked allowance (BookedEcl: the ECL discounted at the original EIR, the Mega Farm programme on its own measure, and a loan with no discounted figure at its undiscounted ECL, counted and named), no longer the undiscounted </w:t>
+      </w:r>
+      <w:r>
+        <w:rPr>
+          <w:rFonts w:ascii="Consolas" w:hAnsi="Consolas"/>
+          <w:b w:val="0"/>
+          <w:i w:val="0"/>
+          <w:sz w:val="18"/>
+        </w:rPr>
+        <w:t>ecl_value</w:t>
+      </w:r>
+      <w:r>
+        <w:rPr>
+          <w:b w:val="0"/>
+          <w:i w:val="0"/>
+        </w:rPr>
+        <w:t>, and the note (screen, PDF, Word note and Excel workings) has three new sections. (f) The loss allowance: undiscounted measure to the discounted allowance, by stage for the closing and the opening month, with an amber warning naming the loans carried undiscounted when a month is mixed. (g) Amounts written off: each write-off between the opening and the closing month from the ledger (the WriteOffClassifier's write-off rule) and the approved write-off register, with the total and the amount still subject to enforcement (IFRS 7.35I, 35L); the movement reconciliation's write-off lines carry the gross written off and the allowance each write-off used. (h) Modified financial assets: IFRS 7.35J(a), 35J(b) and 20A from the confirmed restructure register as the revenue run applied it, with a badge counting the candidates awaiting confirmation by two people (never disclosed until confirmed) and a red message when a confirmed modification has not been applied by the revenue run. Tested in BookedAllowanceAndWriteOffsTest and ModifiedAssetsDisclosureTest. The FLI line in the note's movement reconciliation is still to build.</w:t>
       </w:r>
     </w:p>
     <w:p>

</xml_diff>